<commit_message>
feat: improve cloud documents and learner workflow
</commit_message>
<xml_diff>
--- a/assets/document_templates/Convention_FormProf_Officielle.docx
+++ b/assets/document_templates/Convention_FormProf_Officielle.docx
@@ -185,27 +185,7 @@
           <w:sz w:val="20"/>
           <w:szCs w:val="20"/>
         </w:rPr>
-        <w:t xml:space="preserve">NM FORMATION, 347 rue Alexandra </w:t>
-      </w:r>
-      <w:proofErr w:type="spellStart"/>
-      <w:r>
-        <w:rPr>
-          <w:rFonts w:ascii="Verdana" w:hAnsi="Verdana"/>
-          <w:position w:val="0"/>
-          <w:sz w:val="20"/>
-          <w:szCs w:val="20"/>
-        </w:rPr>
-        <w:t>David-Néel</w:t>
-      </w:r>
-      <w:proofErr w:type="spellEnd"/>
-      <w:r>
-        <w:rPr>
-          <w:rFonts w:ascii="Verdana" w:hAnsi="Verdana"/>
-          <w:position w:val="0"/>
-          <w:sz w:val="20"/>
-          <w:szCs w:val="20"/>
-        </w:rPr>
-        <w:t>, 59120 LOOS.</w:t>
+        <w:t>NM FORMATION, 347 rue Alexandra David-Néel, 59120 LOOS.</w:t>
       </w:r>
       <w:r>
         <w:rPr>
@@ -349,27 +329,7 @@
           <w:sz w:val="20"/>
           <w:szCs w:val="20"/>
         </w:rPr>
-        <w:t xml:space="preserve">    </w:t>
-      </w:r>
-      <w:proofErr w:type="gramStart"/>
-      <w:r>
-        <w:rPr>
-          <w:rFonts w:ascii="Verdana" w:hAnsi="Verdana"/>
-          <w:position w:val="0"/>
-          <w:sz w:val="20"/>
-          <w:szCs w:val="20"/>
-        </w:rPr>
-        <w:t>représentée</w:t>
-      </w:r>
-      <w:proofErr w:type="gramEnd"/>
-      <w:r>
-        <w:rPr>
-          <w:rFonts w:ascii="Verdana" w:hAnsi="Verdana"/>
-          <w:position w:val="0"/>
-          <w:sz w:val="20"/>
-          <w:szCs w:val="20"/>
-        </w:rPr>
-        <w:t xml:space="preserve"> par : </w:t>
+        <w:t xml:space="preserve">    représentée par : </w:t>
       </w:r>
     </w:p>
     <w:p>
@@ -412,14 +372,6 @@
           <w:szCs w:val="20"/>
         </w:rPr>
       </w:pPr>
-      <w:r>
-        <w:rPr>
-          <w:rFonts w:ascii="Verdana" w:hAnsi="Verdana"/>
-          <w:position w:val="0"/>
-          <w:sz w:val="20"/>
-          <w:szCs w:val="20"/>
-        </w:rPr>
-      </w:r>
     </w:p>
     <w:p>
       <w:pPr>
@@ -624,16 +576,6 @@
           <w:szCs w:val="20"/>
         </w:rPr>
         <w:t>-Intitulé de l’action : {{FORMATION_NOM}}</w:t>
-      </w:r>
-      <w:r>
-        <w:rPr>
-          <w:rFonts w:ascii="Verdana" w:hAnsi="Verdana"/>
-          <w:b/>
-          <w:bCs/>
-          <w:position w:val="0"/>
-          <w:sz w:val="20"/>
-          <w:szCs w:val="20"/>
-        </w:rPr>
       </w:r>
     </w:p>
     <w:p>
@@ -1023,7 +965,7 @@
           <w:sz w:val="20"/>
           <w:szCs w:val="20"/>
         </w:rPr>
-        <w:t>Cette formation a pour objectif principal de leur permettre de structurer et de centraliser les données liées au suivi des chantiers, des clients et du chiffre d'affaires afin d'améliorer le pilotage global de leur entreprise.</w:t>
+        <w:t>{{OBJECTIF_PRINCIPAL}}</w:t>
       </w:r>
     </w:p>
     <w:p>
@@ -1064,51 +1006,70 @@
           <w:sz w:val="20"/>
           <w:szCs w:val="20"/>
         </w:rPr>
-        <w:t>Les compétences développées au cours de cette action de formation permettront notamment d'automatiser certains calculs, d'analyser plus efficacement les données d'activité et de faciliter la prise</w:t>
-      </w:r>
-      <w:r>
-        <w:rPr>
-          <w:rFonts w:ascii="Verdana" w:hAnsi="Verdana"/>
-          <w:position w:val="0"/>
-          <w:sz w:val="20"/>
-          <w:szCs w:val="20"/>
-        </w:rPr>
-        <w:t xml:space="preserve"> de </w:t>
-      </w:r>
-      <w:r>
-        <w:rPr>
-          <w:rFonts w:ascii="Verdana" w:hAnsi="Verdana"/>
-          <w:position w:val="0"/>
-          <w:sz w:val="20"/>
-          <w:szCs w:val="20"/>
-        </w:rPr>
-        <w:t>décision grâce à la mise en place d'indicateurs de suivi et d'outils de visualisation adaptés aux besoins de l'entreprise.</w:t>
-      </w:r>
-    </w:p>
-    <w:p>
-      <w:pPr>
-        <w:suppressAutoHyphens w:val="0"/>
-        <w:spacing w:line="240" w:lineRule="auto"/>
-        <w:ind w:leftChars="0" w:left="-2" w:firstLineChars="0" w:hanging="2"/>
-        <w:jc w:val="both"/>
-        <w:textDirection w:val="lrTb"/>
-        <w:textAlignment w:val="auto"/>
-        <w:outlineLvl w:val="9"/>
-        <w:rPr>
-          <w:position w:val="0"/>
-        </w:rPr>
-      </w:pPr>
-      <w:r>
-        <w:rPr>
-          <w:rFonts w:ascii="Verdana" w:hAnsi="Verdana"/>
-          <w:color w:val="000000"/>
-          <w:position w:val="0"/>
-          <w:sz w:val="20"/>
-          <w:szCs w:val="20"/>
-        </w:rPr>
-        <w:lastRenderedPageBreak/>
-        <w:t xml:space="preserve">- Contenu de l’action de formation : </w:t>
-      </w:r>
+        <w:t>{{COMPETENCES_BENEFICES}}</w:t>
+      </w:r>
+      <w:r>
+        <w:rPr>
+          <w:rFonts w:ascii="Verdana" w:hAnsi="Verdana"/>
+          <w:position w:val="0"/>
+          <w:sz w:val="20"/>
+          <w:szCs w:val="20"/>
+        </w:rPr>
+      </w:r>
+      <w:r>
+        <w:rPr>
+          <w:rFonts w:ascii="Verdana" w:hAnsi="Verdana"/>
+          <w:position w:val="0"/>
+          <w:sz w:val="20"/>
+          <w:szCs w:val="20"/>
+        </w:rPr>
+      </w:r>
+    </w:p>
+    <w:p>
+      <w:pPr>
+        <w:suppressAutoHyphens w:val="0"/>
+        <w:spacing w:line="240" w:lineRule="auto"/>
+        <w:ind w:leftChars="0" w:firstLineChars="0" w:firstLine="0"/>
+        <w:textDirection w:val="lrTb"/>
+        <w:textAlignment w:val="auto"/>
+        <w:outlineLvl w:val="9"/>
+        <w:rPr>
+          <w:rFonts w:ascii="Verdana" w:hAnsi="Verdana"/>
+          <w:position w:val="0"/>
+          <w:sz w:val="20"/>
+          <w:szCs w:val="20"/>
+        </w:rPr>
+      </w:pPr>
+    </w:p>
+    <w:p>
+      <w:pPr>
+        <w:suppressAutoHyphens w:val="0"/>
+        <w:spacing w:line="240" w:lineRule="auto"/>
+        <w:ind w:leftChars="0" w:firstLineChars="0" w:firstLine="0"/>
+        <w:textDirection w:val="lrTb"/>
+        <w:textAlignment w:val="auto"/>
+        <w:outlineLvl w:val="9"/>
+        <w:rPr>
+          <w:rFonts w:ascii="Verdana" w:hAnsi="Verdana"/>
+          <w:position w:val="0"/>
+          <w:sz w:val="20"/>
+          <w:szCs w:val="20"/>
+        </w:rPr>
+      </w:pPr>
+    </w:p>
+    <w:p>
+      <w:pPr>
+        <w:suppressAutoHyphens w:val="0"/>
+        <w:spacing w:line="240" w:lineRule="auto"/>
+        <w:ind w:leftChars="0" w:left="-2" w:firstLineChars="0" w:hanging="2"/>
+        <w:jc w:val="both"/>
+        <w:textDirection w:val="lrTb"/>
+        <w:textAlignment w:val="auto"/>
+        <w:outlineLvl w:val="9"/>
+        <w:rPr>
+          <w:position w:val="0"/>
+        </w:rPr>
+      </w:pPr>
       <w:r>
         <w:rPr>
           <w:rFonts w:ascii="Verdana" w:hAnsi="Verdana"/>
@@ -1119,6 +1080,27 @@
           <w:sz w:val="20"/>
           <w:szCs w:val="20"/>
         </w:rPr>
+        <w:lastRenderedPageBreak/>
+        <w:t>- Contenu de l’action de formation :</w:t>
+      </w:r>
+      <w:r>
+        <w:rPr>
+          <w:rFonts w:ascii="Verdana" w:hAnsi="Verdana"/>
+          <w:color w:val="000000"/>
+          <w:position w:val="0"/>
+          <w:sz w:val="20"/>
+          <w:szCs w:val="20"/>
+        </w:rPr>
+        <w:t xml:space="preserve"> </w:t>
+      </w:r>
+      <w:r>
+        <w:rPr>
+          <w:rFonts w:ascii="Verdana" w:hAnsi="Verdana"/>
+          <w:color w:val="000000"/>
+          <w:position w:val="0"/>
+          <w:sz w:val="20"/>
+          <w:szCs w:val="20"/>
+        </w:rPr>
         <w:t>(document attestant de la mise en œuvre d’un parcours pédagogique. Joint en annexe 1)</w:t>
       </w:r>
     </w:p>
@@ -1235,7 +1217,52 @@
           <w:sz w:val="20"/>
           <w:szCs w:val="20"/>
         </w:rPr>
-        <w:t>La formatrice sera {{FORMATEUR_NOM}}, titulaire d'un diplôme de Formateur Professionnel d'Adultes ainsi que d'une certification TOSA Excel niveau Expert. Elle dispose de compétences en bureautique, pilotage d'activités et accompagnement professionnel dans le cadre de formations Excel / Google Sheets appliquées aux besoins des entreprises.</w:t>
+        <w:t>L’intervenant</w:t>
+      </w:r>
+      <w:r>
+        <w:rPr>
+          <w:rFonts w:ascii="Verdana" w:hAnsi="Verdana"/>
+          <w:position w:val="0"/>
+          <w:sz w:val="20"/>
+          <w:szCs w:val="20"/>
+        </w:rPr>
+        <w:t xml:space="preserve"> sera </w:t>
+      </w:r>
+      <w:r>
+        <w:rPr>
+          <w:rFonts w:ascii="Verdana" w:hAnsi="Verdana"/>
+          <w:position w:val="0"/>
+          <w:sz w:val="20"/>
+          <w:szCs w:val="20"/>
+        </w:rPr>
+        <w:t>{{FORMATEUR_NOM_AVEC_CIVILITE}}</w:t>
+      </w:r>
+      <w:r>
+        <w:rPr>
+          <w:rFonts w:ascii="Verdana" w:hAnsi="Verdana"/>
+          <w:position w:val="0"/>
+          <w:sz w:val="20"/>
+          <w:szCs w:val="20"/>
+        </w:rPr>
+        <w:t xml:space="preserve">, titulaire d'un diplôme de Formateur Professionnel d'Adultes ainsi que d'une certification TOSA Excel niveau Expert. </w:t>
+      </w:r>
+      <w:r>
+        <w:rPr>
+          <w:rFonts w:ascii="Verdana" w:hAnsi="Verdana"/>
+          <w:position w:val="0"/>
+          <w:sz w:val="20"/>
+          <w:szCs w:val="20"/>
+        </w:rPr>
+        <w:t>L’intervenant pédagogique</w:t>
+      </w:r>
+      <w:r>
+        <w:rPr>
+          <w:rFonts w:ascii="Verdana" w:hAnsi="Verdana"/>
+          <w:position w:val="0"/>
+          <w:sz w:val="20"/>
+          <w:szCs w:val="20"/>
+        </w:rPr>
+        <w:t xml:space="preserve"> dispose de compétences en bureautique, pilotage d'activités et accompagnement professionnel dans le cadre de formations Excel / Google Sheets appliquées aux besoins des entreprises.</w:t>
       </w:r>
     </w:p>
     <w:p>
@@ -1315,7 +1342,7 @@
           <w:sz w:val="20"/>
           <w:szCs w:val="20"/>
         </w:rPr>
-        <w:t>En cas de question pédagogique le formateur répondra immédiatement au besoin du stagiaire</w:t>
+        <w:t>{{MOYENS_PEDAGOGIQUES_ASSISTANCE}}</w:t>
       </w:r>
     </w:p>
     <w:p>
@@ -1366,7 +1393,7 @@
           <w:sz w:val="20"/>
           <w:szCs w:val="20"/>
         </w:rPr>
-        <w:t>Ressources Pédagogiques PDF fournies au stagiaire en entrée de formation</w:t>
+        <w:t>Ressources pédagogiques PDF fournies {{PARTICIPANT_DATIF}} en entrée de formation</w:t>
       </w:r>
     </w:p>
     <w:p>
@@ -1399,7 +1426,7 @@
           <w:sz w:val="20"/>
           <w:szCs w:val="20"/>
         </w:rPr>
-        <w:t>Apport théorique du formateur et démonstrations pratiques</w:t>
+        <w:t>Apport théorique de l’intervenant et démonstrations pratiques</w:t>
       </w:r>
     </w:p>
     <w:p>
@@ -1465,27 +1492,25 @@
           <w:sz w:val="20"/>
           <w:szCs w:val="20"/>
         </w:rPr>
-        <w:t xml:space="preserve">Exercices pratiques et cas concrets lies </w:t>
-      </w:r>
-      <w:r>
-        <w:rPr>
-          <w:rFonts w:ascii="Verdana" w:hAnsi="Verdana"/>
-          <w:color w:val="000000"/>
-          <w:position w:val="0"/>
-          <w:sz w:val="20"/>
-          <w:szCs w:val="20"/>
-        </w:rPr>
-        <w:t>à</w:t>
-      </w:r>
-      <w:r>
-        <w:rPr>
-          <w:rFonts w:ascii="Verdana" w:hAnsi="Verdana"/>
-          <w:color w:val="000000"/>
-          <w:position w:val="0"/>
-          <w:sz w:val="20"/>
-          <w:szCs w:val="20"/>
-        </w:rPr>
-        <w:t xml:space="preserve"> l'activités BTP</w:t>
+        <w:t>Exercices pratiques et cas concrets liés à l’activité BTP</w:t>
+      </w:r>
+      <w:r>
+        <w:rPr>
+          <w:rFonts w:ascii="Verdana" w:hAnsi="Verdana"/>
+          <w:color w:val="000000"/>
+          <w:position w:val="0"/>
+          <w:sz w:val="20"/>
+          <w:szCs w:val="20"/>
+        </w:rPr>
+      </w:r>
+      <w:r>
+        <w:rPr>
+          <w:rFonts w:ascii="Verdana" w:hAnsi="Verdana"/>
+          <w:color w:val="000000"/>
+          <w:position w:val="0"/>
+          <w:sz w:val="20"/>
+          <w:szCs w:val="20"/>
+        </w:rPr>
       </w:r>
     </w:p>
     <w:p>
@@ -1518,17 +1543,16 @@
           <w:sz w:val="20"/>
           <w:szCs w:val="20"/>
         </w:rPr>
-        <w:t>E</w:t>
-      </w:r>
-      <w:r>
-        <w:rPr>
-          <w:rFonts w:ascii="Verdana" w:hAnsi="Verdana"/>
-          <w:color w:val="000000"/>
-          <w:position w:val="0"/>
-          <w:sz w:val="20"/>
-          <w:szCs w:val="20"/>
-        </w:rPr>
-        <w:t>changes en visioconférence tout au long de la formation</w:t>
+        <w:t>Échanges avec l’intervenant tout au long de la formation selon la modalité prévue</w:t>
+      </w:r>
+      <w:r>
+        <w:rPr>
+          <w:rFonts w:ascii="Verdana" w:hAnsi="Verdana"/>
+          <w:color w:val="000000"/>
+          <w:position w:val="0"/>
+          <w:sz w:val="20"/>
+          <w:szCs w:val="20"/>
+        </w:rPr>
       </w:r>
     </w:p>
     <w:p>
@@ -1680,7 +1704,16 @@
           <w:sz w:val="20"/>
           <w:szCs w:val="20"/>
         </w:rPr>
-        <w:t>Le formateur sera muni de ressources pédagogiques en format numérique et PDF, ainsi que d'un ordinateur</w:t>
+        <w:t>L’intervenant sera muni de ressources pédagogiques en format numérique et PDF, ainsi que d’un ordinateur.</w:t>
+      </w:r>
+      <w:r>
+        <w:rPr>
+          <w:rFonts w:ascii="Verdana" w:hAnsi="Verdana"/>
+          <w:color w:val="000000"/>
+          <w:position w:val="0"/>
+          <w:sz w:val="20"/>
+          <w:szCs w:val="20"/>
+        </w:rPr>
       </w:r>
     </w:p>
     <w:p>
@@ -1712,20 +1745,8 @@
           <w:sz w:val="20"/>
           <w:szCs w:val="20"/>
         </w:rPr>
-        <w:t xml:space="preserve">Formation réalisée à distance via Google </w:t>
-      </w:r>
-      <w:proofErr w:type="spellStart"/>
-      <w:r>
-        <w:rPr>
-          <w:rFonts w:ascii="Verdana" w:hAnsi="Verdana"/>
-          <w:color w:val="000000"/>
-          <w:position w:val="0"/>
-          <w:sz w:val="20"/>
-          <w:szCs w:val="20"/>
-        </w:rPr>
-        <w:t>Meet</w:t>
-      </w:r>
-      <w:proofErr w:type="spellEnd"/>
+        <w:t>{{MODALITE_TECHNIQUE}}</w:t>
+      </w:r>
     </w:p>
     <w:p>
       <w:pPr>
@@ -1788,7 +1809,7 @@
           <w:sz w:val="20"/>
           <w:szCs w:val="20"/>
         </w:rPr>
-        <w:t>Ordinateur et connexion internet requis</w:t>
+        <w:t>Ordinateur équipé des outils nécessaires à la formation.</w:t>
       </w:r>
     </w:p>
     <w:p>
@@ -2147,27 +2168,25 @@
           <w:sz w:val="20"/>
           <w:szCs w:val="20"/>
         </w:rPr>
-        <w:t>Ressources P</w:t>
-      </w:r>
-      <w:r>
-        <w:rPr>
-          <w:rFonts w:ascii="Verdana" w:hAnsi="Verdana"/>
-          <w:color w:val="000000"/>
-          <w:position w:val="0"/>
-          <w:sz w:val="20"/>
-          <w:szCs w:val="20"/>
-        </w:rPr>
-        <w:t>é</w:t>
-      </w:r>
-      <w:r>
-        <w:rPr>
-          <w:rFonts w:ascii="Verdana" w:hAnsi="Verdana"/>
-          <w:color w:val="000000"/>
-          <w:position w:val="0"/>
-          <w:sz w:val="20"/>
-          <w:szCs w:val="20"/>
-        </w:rPr>
-        <w:t>dagogiques PDF fournies au stagiaire en entrée de formation lui permettant !'appropriation du contenu pendant et après la formation</w:t>
+        <w:t>{{RESSOURCES_PEDAGOGIQUES_TEXTE}}</w:t>
+      </w:r>
+      <w:r>
+        <w:rPr>
+          <w:rFonts w:ascii="Verdana" w:hAnsi="Verdana"/>
+          <w:color w:val="000000"/>
+          <w:position w:val="0"/>
+          <w:sz w:val="20"/>
+          <w:szCs w:val="20"/>
+        </w:rPr>
+      </w:r>
+      <w:r>
+        <w:rPr>
+          <w:rFonts w:ascii="Verdana" w:hAnsi="Verdana"/>
+          <w:color w:val="000000"/>
+          <w:position w:val="0"/>
+          <w:sz w:val="20"/>
+          <w:szCs w:val="20"/>
+        </w:rPr>
       </w:r>
     </w:p>
     <w:p>
@@ -2206,17 +2225,18 @@
           <w:sz w:val="20"/>
           <w:szCs w:val="20"/>
         </w:rPr>
-        <w:t xml:space="preserve">- Durée de l’action de formation : {{FORMATION_DUREE}} </w:t>
-      </w:r>
-      <w:r>
-        <w:rPr>
-          <w:rFonts w:ascii="Verdana" w:hAnsi="Verdana"/>
-          <w:position w:val="0"/>
-          <w:sz w:val="20"/>
-          <w:szCs w:val="20"/>
-        </w:rPr>
-      </w:r>
-      <w:r>
+        <w:t>- Durée de l’action de formation : {{FORMATION_DUREE}} </w:t>
+      </w:r>
+    </w:p>
+    <w:p>
+      <w:pPr>
+        <w:suppressAutoHyphens w:val="0"/>
+        <w:spacing w:line="240" w:lineRule="auto"/>
+        <w:ind w:leftChars="0" w:left="-2" w:firstLineChars="0" w:hanging="2"/>
+        <w:jc w:val="both"/>
+        <w:textDirection w:val="lrTb"/>
+        <w:textAlignment w:val="auto"/>
+        <w:outlineLvl w:val="9"/>
         <w:rPr>
           <w:rFonts w:ascii="Verdana" w:hAnsi="Verdana"/>
           <w:b/>
@@ -2225,65 +2245,16 @@
           <w:sz w:val="20"/>
           <w:szCs w:val="20"/>
         </w:rPr>
-      </w:r>
-      <w:r>
-        <w:rPr>
-          <w:rFonts w:ascii="Verdana" w:hAnsi="Verdana"/>
-          <w:position w:val="0"/>
-          <w:sz w:val="20"/>
-          <w:szCs w:val="20"/>
-        </w:rPr>
-      </w:r>
-    </w:p>
-    <w:p>
-      <w:pPr>
-        <w:suppressAutoHyphens w:val="0"/>
-        <w:spacing w:line="240" w:lineRule="auto"/>
-        <w:ind w:leftChars="0" w:left="-2" w:firstLineChars="0" w:hanging="2"/>
-        <w:jc w:val="both"/>
-        <w:textDirection w:val="lrTb"/>
-        <w:textAlignment w:val="auto"/>
-        <w:outlineLvl w:val="9"/>
-        <w:rPr>
-          <w:rFonts w:ascii="Verdana" w:hAnsi="Verdana"/>
-          <w:b/>
-          <w:bCs/>
-          <w:position w:val="0"/>
-          <w:sz w:val="20"/>
-          <w:szCs w:val="20"/>
-        </w:rPr>
-      </w:pPr>
-      <w:r>
-        <w:rPr>
-          <w:rFonts w:ascii="Verdana" w:hAnsi="Verdana"/>
-          <w:position w:val="0"/>
-          <w:sz w:val="20"/>
-          <w:szCs w:val="20"/>
-        </w:rPr>
-        <w:t>- Lieu : {{FORMATION_MODALITE}}</w:t>
-      </w:r>
-      <w:r>
-        <w:rPr>
-          <w:rFonts w:ascii="Verdana" w:hAnsi="Verdana"/>
-          <w:b/>
-          <w:bCs/>
-          <w:position w:val="0"/>
-          <w:sz w:val="20"/>
-          <w:szCs w:val="20"/>
-        </w:rPr>
-      </w:r>
-      <w:proofErr w:type="spellStart"/>
-      <w:r>
-        <w:rPr>
-          <w:rFonts w:ascii="Verdana" w:hAnsi="Verdana"/>
-          <w:b/>
-          <w:bCs/>
-          <w:position w:val="0"/>
-          <w:sz w:val="20"/>
-          <w:szCs w:val="20"/>
-        </w:rPr>
-      </w:r>
-      <w:proofErr w:type="spellEnd"/>
+      </w:pPr>
+      <w:r>
+        <w:rPr>
+          <w:rFonts w:ascii="Verdana" w:hAnsi="Verdana"/>
+          <w:position w:val="0"/>
+          <w:sz w:val="20"/>
+          <w:szCs w:val="20"/>
+        </w:rPr>
+        <w:t>- Lieu / modalité : {{FORMATION_LIEU_MODALITE}}</w:t>
+      </w:r>
     </w:p>
     <w:p>
       <w:pPr>
@@ -2541,11 +2512,6 @@
         <w:textAlignment w:val="auto"/>
         <w:outlineLvl w:val="9"/>
         <w:rPr>
-          <w:position w:val="0"/>
-        </w:rPr>
-      </w:pPr>
-      <w:r>
-        <w:rPr>
           <w:rFonts w:ascii="Verdana" w:hAnsi="Verdana"/>
           <w:b/>
           <w:bCs/>
@@ -2555,10 +2521,17 @@
           <w:szCs w:val="22"/>
           <w:u w:val="single"/>
         </w:rPr>
-        <w:lastRenderedPageBreak/>
-        <w:t>Article 2 : Effectif formé</w:t>
-      </w:r>
-      <w:r>
+      </w:pPr>
+    </w:p>
+    <w:p>
+      <w:pPr>
+        <w:suppressAutoHyphens w:val="0"/>
+        <w:spacing w:line="240" w:lineRule="auto"/>
+        <w:ind w:leftChars="0" w:left="-2" w:firstLineChars="0" w:hanging="2"/>
+        <w:jc w:val="both"/>
+        <w:textDirection w:val="lrTb"/>
+        <w:textAlignment w:val="auto"/>
+        <w:outlineLvl w:val="9"/>
         <w:rPr>
           <w:rFonts w:ascii="Verdana" w:hAnsi="Verdana"/>
           <w:b/>
@@ -2569,6 +2542,45 @@
           <w:szCs w:val="22"/>
           <w:u w:val="single"/>
         </w:rPr>
+      </w:pPr>
+    </w:p>
+    <w:p>
+      <w:pPr>
+        <w:suppressAutoHyphens w:val="0"/>
+        <w:spacing w:line="240" w:lineRule="auto"/>
+        <w:ind w:leftChars="0" w:left="-2" w:firstLineChars="0" w:hanging="2"/>
+        <w:jc w:val="both"/>
+        <w:textDirection w:val="lrTb"/>
+        <w:textAlignment w:val="auto"/>
+        <w:outlineLvl w:val="9"/>
+        <w:rPr>
+          <w:position w:val="0"/>
+        </w:rPr>
+      </w:pPr>
+      <w:r>
+        <w:rPr>
+          <w:rFonts w:ascii="Verdana" w:hAnsi="Verdana"/>
+          <w:b/>
+          <w:bCs/>
+          <w:color w:val="000000"/>
+          <w:position w:val="0"/>
+          <w:sz w:val="22"/>
+          <w:szCs w:val="22"/>
+          <w:u w:val="single"/>
+        </w:rPr>
+        <w:t>Article 2 : Effectif formé</w:t>
+      </w:r>
+      <w:r>
+        <w:rPr>
+          <w:rFonts w:ascii="Verdana" w:hAnsi="Verdana"/>
+          <w:b/>
+          <w:bCs/>
+          <w:color w:val="000000"/>
+          <w:position w:val="0"/>
+          <w:sz w:val="22"/>
+          <w:szCs w:val="22"/>
+          <w:u w:val="single"/>
+        </w:rPr>
         <w:t xml:space="preserve"> et public visé</w:t>
       </w:r>
     </w:p>
@@ -2616,12 +2628,11 @@
           <w:sz w:val="20"/>
           <w:szCs w:val="20"/>
         </w:rPr>
-        <w:t>Conformément à l’article L6313-3 du Code du travail, cette action de formation a pour objectif de favoriser l’adaptation des participants à leur poste de travail, le développement de leurs compétences ainsi que leur maintien dans l’emploi.</w:t>
-      </w:r>
-    </w:p>
-    <w:p>
-      <w:pPr>
-        <w:pStyle w:val="Paragraphedeliste"/>
+        <w:t>{{PUBLIC_ADAPTATION_TEXTE}}</w:t>
+      </w:r>
+    </w:p>
+    <w:p>
+      <w:pPr>
         <w:suppressAutoHyphens w:val="0"/>
         <w:spacing w:line="240" w:lineRule="auto"/>
         <w:ind w:leftChars="0" w:left="720" w:firstLineChars="0" w:firstLine="0"/>
@@ -2663,12 +2674,11 @@
           <w:sz w:val="20"/>
           <w:szCs w:val="20"/>
         </w:rPr>
-        <w:t>Cette formation s’adresse aux dirigeants et professionnels souhaitant développer leurs compétences en pilotage d’activité, gestion administrative et utilisation des outils bureautiques.</w:t>
-      </w:r>
-    </w:p>
-    <w:p>
-      <w:pPr>
-        <w:pStyle w:val="Paragraphedeliste"/>
+        <w:t>Public visé : {{FORMATION_PUBLIC_VISE}}</w:t>
+      </w:r>
+    </w:p>
+    <w:p>
+      <w:pPr>
         <w:suppressAutoHyphens w:val="0"/>
         <w:spacing w:line="240" w:lineRule="auto"/>
         <w:ind w:leftChars="0" w:left="720" w:firstLineChars="0" w:firstLine="0"/>
@@ -2710,12 +2720,11 @@
           <w:sz w:val="20"/>
           <w:szCs w:val="20"/>
         </w:rPr>
-        <w:t>L’organisme NM FORMATION accueillera les participants suivants :</w:t>
-      </w:r>
-    </w:p>
-    <w:p>
-      <w:pPr>
-        <w:pStyle w:val="Paragraphedeliste"/>
+        <w:t>{{PARTICIPANTS_INTRO}}</w:t>
+      </w:r>
+    </w:p>
+    <w:p>
+      <w:pPr>
         <w:suppressAutoHyphens w:val="0"/>
         <w:spacing w:line="240" w:lineRule="auto"/>
         <w:ind w:leftChars="0" w:left="720" w:firstLineChars="0" w:firstLine="0"/>
@@ -2762,39 +2771,7 @@
           <w:sz w:val="20"/>
           <w:szCs w:val="20"/>
         </w:rPr>
-        <w:t>{{PARTICIPANTS_LIGNE}}</w:t>
-      </w:r>
-    </w:p>
-    <w:p>
-      <w:pPr>
-        <w:pStyle w:val="Paragraphedeliste"/>
-        <w:numPr>
-          <w:ilvl w:val="0"/>
-          <w:numId w:val="7"/>
-        </w:numPr>
-        <w:suppressAutoHyphens w:val="0"/>
-        <w:spacing w:line="240" w:lineRule="auto"/>
-        <w:ind w:leftChars="0" w:firstLineChars="0"/>
-        <w:jc w:val="both"/>
-        <w:textDirection w:val="lrTb"/>
-        <w:textAlignment w:val="baseline"/>
-        <w:outlineLvl w:val="9"/>
-        <w:rPr>
-          <w:rFonts w:ascii="Verdana" w:hAnsi="Verdana"/>
-          <w:color w:val="000000"/>
-          <w:position w:val="0"/>
-          <w:sz w:val="20"/>
-          <w:szCs w:val="20"/>
-        </w:rPr>
-      </w:pPr>
-      <w:r>
-        <w:rPr>
-          <w:rFonts w:ascii="Verdana" w:hAnsi="Verdana"/>
-          <w:color w:val="000000"/>
-          <w:position w:val="0"/>
-          <w:sz w:val="20"/>
-          <w:szCs w:val="20"/>
-        </w:rPr>
+        <w:t>{{PARTICIPANTS_AVEC_STATUT}}</w:t>
       </w:r>
     </w:p>
     <w:p>
@@ -2898,7 +2875,53 @@
           <w:sz w:val="20"/>
           <w:szCs w:val="20"/>
         </w:rPr>
-        <w:t xml:space="preserve">Frais de formation : forfait de formation intra-entreprise = {{FORMATION_PRIX}}. </w:t>
+        <w:t>Frais de formation : forfait de formation intra-entreprise = {{FORMATION_PRIX}}. </w:t>
+      </w:r>
+    </w:p>
+    <w:p>
+      <w:pPr>
+        <w:suppressAutoHyphens w:val="0"/>
+        <w:spacing w:line="240" w:lineRule="auto"/>
+        <w:ind w:leftChars="0" w:left="-2" w:firstLineChars="0" w:hanging="2"/>
+        <w:jc w:val="both"/>
+        <w:textDirection w:val="lrTb"/>
+        <w:textAlignment w:val="auto"/>
+        <w:outlineLvl w:val="9"/>
+        <w:rPr>
+          <w:position w:val="0"/>
+        </w:rPr>
+      </w:pPr>
+      <w:r>
+        <w:rPr>
+          <w:rFonts w:ascii="Verdana" w:hAnsi="Verdana"/>
+          <w:position w:val="0"/>
+          <w:sz w:val="20"/>
+          <w:szCs w:val="20"/>
+        </w:rPr>
+        <w:t>Soit un total de : {{FORMATION_PRIX}} </w:t>
+      </w:r>
+    </w:p>
+    <w:p>
+      <w:pPr>
+        <w:suppressAutoHyphens w:val="0"/>
+        <w:spacing w:line="240" w:lineRule="auto"/>
+        <w:ind w:leftChars="0" w:left="-2" w:firstLineChars="0" w:hanging="2"/>
+        <w:jc w:val="both"/>
+        <w:textDirection w:val="lrTb"/>
+        <w:textAlignment w:val="auto"/>
+        <w:outlineLvl w:val="9"/>
+        <w:rPr>
+          <w:position w:val="0"/>
+        </w:rPr>
+      </w:pPr>
+      <w:r>
+        <w:rPr>
+          <w:rFonts w:ascii="Verdana" w:hAnsi="Verdana"/>
+          <w:position w:val="0"/>
+          <w:sz w:val="20"/>
+          <w:szCs w:val="20"/>
+        </w:rPr>
+        <w:t xml:space="preserve">Sommes versées par l’entreprise à titre d’acomptes : </w:t>
       </w:r>
       <w:r>
         <w:rPr>
@@ -2909,224 +2932,94 @@
           <w:sz w:val="20"/>
           <w:szCs w:val="20"/>
         </w:rPr>
-      </w:r>
-      <w:r>
-        <w:rPr>
-          <w:rFonts w:ascii="Verdana" w:hAnsi="Verdana"/>
-          <w:position w:val="0"/>
-          <w:sz w:val="20"/>
-          <w:szCs w:val="20"/>
-        </w:rPr>
-      </w:r>
-    </w:p>
-    <w:p>
-      <w:pPr>
-        <w:suppressAutoHyphens w:val="0"/>
-        <w:spacing w:line="240" w:lineRule="auto"/>
-        <w:ind w:leftChars="0" w:left="-2" w:firstLineChars="0" w:hanging="2"/>
-        <w:jc w:val="both"/>
-        <w:textDirection w:val="lrTb"/>
-        <w:textAlignment w:val="auto"/>
-        <w:outlineLvl w:val="9"/>
-        <w:rPr>
-          <w:position w:val="0"/>
-        </w:rPr>
-      </w:pPr>
-      <w:r>
-        <w:rPr>
-          <w:rFonts w:ascii="Verdana" w:hAnsi="Verdana"/>
-          <w:position w:val="0"/>
-          <w:sz w:val="20"/>
-          <w:szCs w:val="20"/>
-        </w:rPr>
-        <w:t xml:space="preserve">Soit un total de : {{FORMATION_PRIX}} </w:t>
-      </w:r>
+        <w:t>0 € HT</w:t>
+      </w:r>
+    </w:p>
+    <w:p>
+      <w:pPr>
+        <w:suppressAutoHyphens w:val="0"/>
+        <w:spacing w:line="240" w:lineRule="auto"/>
+        <w:ind w:leftChars="0" w:left="-2" w:firstLineChars="0" w:hanging="2"/>
+        <w:jc w:val="both"/>
+        <w:textDirection w:val="lrTb"/>
+        <w:textAlignment w:val="auto"/>
+        <w:outlineLvl w:val="9"/>
+        <w:rPr>
+          <w:position w:val="0"/>
+        </w:rPr>
+      </w:pPr>
+      <w:r>
+        <w:rPr>
+          <w:rFonts w:ascii="Verdana" w:hAnsi="Verdana"/>
+          <w:position w:val="0"/>
+          <w:sz w:val="20"/>
+          <w:szCs w:val="20"/>
+        </w:rPr>
+        <w:t>Sommes restant dues :{{FORMATION_PRIX}} </w:t>
+      </w:r>
+    </w:p>
+    <w:p>
+      <w:pPr>
+        <w:suppressAutoHyphens w:val="0"/>
+        <w:spacing w:line="240" w:lineRule="auto"/>
+        <w:ind w:leftChars="0" w:left="0" w:firstLineChars="0" w:firstLine="0"/>
+        <w:textDirection w:val="lrTb"/>
+        <w:textAlignment w:val="auto"/>
+        <w:outlineLvl w:val="9"/>
+        <w:rPr>
+          <w:rFonts w:ascii="Verdana" w:hAnsi="Verdana"/>
+          <w:position w:val="0"/>
+          <w:sz w:val="20"/>
+          <w:szCs w:val="20"/>
+        </w:rPr>
+      </w:pPr>
+      <w:r>
+        <w:rPr>
+          <w:rFonts w:ascii="Verdana" w:hAnsi="Verdana"/>
+          <w:position w:val="0"/>
+          <w:sz w:val="20"/>
+          <w:szCs w:val="20"/>
+        </w:rPr>
+        <w:t>T.V.A. : Exonérée de TVA - article 261-4-4° du CGI</w:t>
+      </w:r>
+    </w:p>
+    <w:p>
+      <w:pPr>
+        <w:suppressAutoHyphens w:val="0"/>
+        <w:spacing w:line="240" w:lineRule="auto"/>
+        <w:ind w:leftChars="0" w:left="0" w:firstLineChars="0" w:firstLine="0"/>
+        <w:textDirection w:val="lrTb"/>
+        <w:textAlignment w:val="auto"/>
+        <w:outlineLvl w:val="9"/>
+        <w:rPr>
+          <w:position w:val="0"/>
+        </w:rPr>
+      </w:pPr>
+    </w:p>
+    <w:p>
+      <w:pPr>
+        <w:suppressAutoHyphens w:val="0"/>
+        <w:spacing w:line="240" w:lineRule="auto"/>
+        <w:ind w:leftChars="0" w:left="-2" w:firstLineChars="0" w:hanging="2"/>
+        <w:jc w:val="both"/>
+        <w:textDirection w:val="lrTb"/>
+        <w:textAlignment w:val="auto"/>
+        <w:outlineLvl w:val="9"/>
+        <w:rPr>
+          <w:position w:val="0"/>
+        </w:rPr>
+      </w:pPr>
       <w:r>
         <w:rPr>
           <w:rFonts w:ascii="Verdana" w:hAnsi="Verdana"/>
           <w:b/>
           <w:bCs/>
-          <w:position w:val="0"/>
-          <w:sz w:val="20"/>
-          <w:szCs w:val="20"/>
-        </w:rPr>
-      </w:r>
-      <w:r>
-        <w:rPr>
-          <w:rFonts w:ascii="Verdana" w:hAnsi="Verdana"/>
-          <w:position w:val="0"/>
-          <w:sz w:val="20"/>
-          <w:szCs w:val="20"/>
-        </w:rPr>
-      </w:r>
-    </w:p>
-    <w:p>
-      <w:pPr>
-        <w:suppressAutoHyphens w:val="0"/>
-        <w:spacing w:line="240" w:lineRule="auto"/>
-        <w:ind w:leftChars="0" w:left="-2" w:firstLineChars="0" w:hanging="2"/>
-        <w:jc w:val="both"/>
-        <w:textDirection w:val="lrTb"/>
-        <w:textAlignment w:val="auto"/>
-        <w:outlineLvl w:val="9"/>
-        <w:rPr>
-          <w:position w:val="0"/>
-        </w:rPr>
-      </w:pPr>
-      <w:r>
-        <w:rPr>
-          <w:rFonts w:ascii="Verdana" w:hAnsi="Verdana"/>
-          <w:position w:val="0"/>
-          <w:sz w:val="20"/>
-          <w:szCs w:val="20"/>
-        </w:rPr>
-        <w:t xml:space="preserve">Sommes versées par l’entreprise à titre d’acomptes : </w:t>
-      </w:r>
-      <w:r>
-        <w:rPr>
-          <w:rFonts w:ascii="Verdana" w:hAnsi="Verdana"/>
-          <w:b/>
-          <w:bCs/>
-          <w:position w:val="0"/>
-          <w:sz w:val="20"/>
-          <w:szCs w:val="20"/>
-        </w:rPr>
-        <w:t>0 € HT</w:t>
-      </w:r>
-    </w:p>
-    <w:p>
-      <w:pPr>
-        <w:suppressAutoHyphens w:val="0"/>
-        <w:spacing w:line="240" w:lineRule="auto"/>
-        <w:ind w:leftChars="0" w:left="-2" w:firstLineChars="0" w:hanging="2"/>
-        <w:jc w:val="both"/>
-        <w:textDirection w:val="lrTb"/>
-        <w:textAlignment w:val="auto"/>
-        <w:outlineLvl w:val="9"/>
-        <w:rPr>
-          <w:position w:val="0"/>
-        </w:rPr>
-      </w:pPr>
-      <w:r>
-        <w:rPr>
-          <w:rFonts w:ascii="Verdana" w:hAnsi="Verdana"/>
-          <w:position w:val="0"/>
-          <w:sz w:val="20"/>
-          <w:szCs w:val="20"/>
-        </w:rPr>
-        <w:t xml:space="preserve">Sommes restant dues :{{FORMATION_PRIX}} </w:t>
-      </w:r>
-      <w:r>
-        <w:rPr>
-          <w:rFonts w:ascii="Verdana" w:hAnsi="Verdana"/>
-          <w:b/>
-          <w:bCs/>
-          <w:position w:val="0"/>
-          <w:sz w:val="20"/>
-          <w:szCs w:val="20"/>
-        </w:rPr>
-      </w:r>
-    </w:p>
-    <w:p>
-      <w:pPr>
-        <w:suppressAutoHyphens w:val="0"/>
-        <w:spacing w:line="240" w:lineRule="auto"/>
-        <w:ind w:leftChars="0" w:left="0" w:firstLineChars="0" w:firstLine="0"/>
-        <w:textDirection w:val="lrTb"/>
-        <w:textAlignment w:val="auto"/>
-        <w:outlineLvl w:val="9"/>
-        <w:rPr>
-          <w:rFonts w:ascii="Verdana" w:hAnsi="Verdana"/>
-          <w:position w:val="0"/>
-          <w:sz w:val="20"/>
-          <w:szCs w:val="20"/>
-        </w:rPr>
-      </w:pPr>
-      <w:r>
-        <w:rPr>
-          <w:rFonts w:ascii="Verdana" w:hAnsi="Verdana"/>
-          <w:position w:val="0"/>
-          <w:sz w:val="20"/>
-          <w:szCs w:val="20"/>
-        </w:rPr>
-        <w:t>T.V.A. : Exonérée de TVA - article 261-4-4° du CGI</w:t>
-      </w:r>
-    </w:p>
-    <w:p>
-      <w:pPr>
-        <w:suppressAutoHyphens w:val="0"/>
-        <w:spacing w:line="240" w:lineRule="auto"/>
-        <w:ind w:leftChars="0" w:left="0" w:firstLineChars="0" w:firstLine="0"/>
-        <w:textDirection w:val="lrTb"/>
-        <w:textAlignment w:val="auto"/>
-        <w:outlineLvl w:val="9"/>
-        <w:rPr>
-          <w:position w:val="0"/>
-        </w:rPr>
-      </w:pPr>
-    </w:p>
-    <w:p>
-      <w:pPr>
-        <w:suppressAutoHyphens w:val="0"/>
-        <w:spacing w:line="240" w:lineRule="auto"/>
-        <w:ind w:leftChars="0" w:left="-2" w:firstLineChars="0" w:hanging="2"/>
-        <w:jc w:val="both"/>
-        <w:textDirection w:val="lrTb"/>
-        <w:textAlignment w:val="auto"/>
-        <w:outlineLvl w:val="9"/>
-        <w:rPr>
-          <w:position w:val="0"/>
-        </w:rPr>
-      </w:pPr>
-      <w:r>
-        <w:rPr>
-          <w:rFonts w:ascii="Verdana" w:hAnsi="Verdana"/>
-          <w:b/>
-          <w:bCs/>
-          <w:color w:val="000000"/>
-          <w:position w:val="0"/>
-          <w:sz w:val="20"/>
-          <w:szCs w:val="20"/>
-        </w:rPr>
-        <w:t xml:space="preserve">TOTAL GENERAL : {{FORMATION_PRIX}} NET de TVA </w:t>
-      </w:r>
-      <w:r>
-        <w:rPr>
-          <w:rFonts w:ascii="Verdana" w:hAnsi="Verdana"/>
-          <w:b/>
-          <w:bCs/>
-          <w:color w:val="000000"/>
-          <w:position w:val="0"/>
-          <w:sz w:val="20"/>
-          <w:szCs w:val="20"/>
-        </w:rPr>
-      </w:r>
-      <w:r>
-        <w:rPr>
-          <w:rFonts w:ascii="Verdana" w:hAnsi="Verdana"/>
-          <w:color w:val="0070C0"/>
-          <w:position w:val="0"/>
-          <w:sz w:val="20"/>
-          <w:szCs w:val="20"/>
-        </w:rPr>
-      </w:r>
-      <w:r>
-        <w:rPr>
-          <w:rFonts w:ascii="Verdana" w:hAnsi="Verdana"/>
-          <w:b/>
-          <w:bCs/>
-          <w:position w:val="0"/>
-          <w:sz w:val="20"/>
-          <w:szCs w:val="20"/>
-        </w:rPr>
-      </w:r>
-      <w:r>
-        <w:rPr>
-          <w:rFonts w:ascii="Verdana" w:hAnsi="Verdana"/>
-          <w:position w:val="0"/>
-          <w:sz w:val="20"/>
-          <w:szCs w:val="20"/>
-        </w:rPr>
+          <w:color w:val="000000"/>
+          <w:position w:val="0"/>
+          <w:sz w:val="20"/>
+          <w:szCs w:val="20"/>
+        </w:rPr>
+        <w:t>TOTAL GENERAL : {{FORMATION_PRIX}} NET de TVA </w:t>
       </w:r>
     </w:p>
     <w:p>
@@ -3203,299 +3096,232 @@
           <w:sz w:val="20"/>
           <w:szCs w:val="20"/>
         </w:rPr>
-        <w:t>L</w:t>
-      </w:r>
-      <w:r>
-        <w:rPr>
-          <w:rFonts w:ascii="Verdana" w:hAnsi="Verdana"/>
-          <w:color w:val="000000"/>
-          <w:position w:val="0"/>
-          <w:sz w:val="20"/>
-          <w:szCs w:val="20"/>
-        </w:rPr>
-        <w:t>a</w:t>
-      </w:r>
-      <w:r>
-        <w:rPr>
-          <w:rFonts w:ascii="Verdana" w:hAnsi="Verdana"/>
-          <w:color w:val="000000"/>
-          <w:position w:val="0"/>
-          <w:sz w:val="20"/>
-          <w:szCs w:val="20"/>
-        </w:rPr>
-        <w:t xml:space="preserve"> format</w:t>
-      </w:r>
-      <w:r>
-        <w:rPr>
-          <w:rFonts w:ascii="Verdana" w:hAnsi="Verdana"/>
-          <w:color w:val="000000"/>
-          <w:position w:val="0"/>
-          <w:sz w:val="20"/>
-          <w:szCs w:val="20"/>
-        </w:rPr>
-        <w:t>rice</w:t>
-      </w:r>
-      <w:r>
-        <w:rPr>
-          <w:rFonts w:ascii="Verdana" w:hAnsi="Verdana"/>
-          <w:color w:val="000000"/>
-          <w:position w:val="0"/>
-          <w:sz w:val="20"/>
-          <w:szCs w:val="20"/>
-        </w:rPr>
-        <w:t xml:space="preserve"> accompagne et assiste le</w:t>
-      </w:r>
-      <w:r>
-        <w:rPr>
-          <w:rFonts w:ascii="Verdana" w:hAnsi="Verdana"/>
-          <w:color w:val="000000"/>
-          <w:position w:val="0"/>
-          <w:sz w:val="20"/>
-          <w:szCs w:val="20"/>
-        </w:rPr>
-        <w:t>s</w:t>
-      </w:r>
-      <w:r>
-        <w:rPr>
-          <w:rFonts w:ascii="Verdana" w:hAnsi="Verdana"/>
-          <w:color w:val="000000"/>
-          <w:position w:val="0"/>
-          <w:sz w:val="20"/>
-          <w:szCs w:val="20"/>
-        </w:rPr>
-        <w:t xml:space="preserve"> stagiaire</w:t>
-      </w:r>
-      <w:r>
-        <w:rPr>
-          <w:rFonts w:ascii="Verdana" w:hAnsi="Verdana"/>
-          <w:color w:val="000000"/>
-          <w:position w:val="0"/>
-          <w:sz w:val="20"/>
-          <w:szCs w:val="20"/>
-        </w:rPr>
-        <w:t>s</w:t>
-      </w:r>
-      <w:r>
-        <w:rPr>
-          <w:rFonts w:ascii="Verdana" w:hAnsi="Verdana"/>
-          <w:color w:val="000000"/>
-          <w:position w:val="0"/>
-          <w:sz w:val="20"/>
-          <w:szCs w:val="20"/>
-        </w:rPr>
-        <w:t xml:space="preserve"> tout au long de la formation qui sera dispensée </w:t>
-      </w:r>
-      <w:r>
-        <w:rPr>
-          <w:rFonts w:ascii="Verdana" w:hAnsi="Verdana"/>
-          <w:color w:val="000000"/>
-          <w:position w:val="0"/>
-          <w:sz w:val="20"/>
-          <w:szCs w:val="20"/>
-        </w:rPr>
-        <w:t>à</w:t>
-      </w:r>
-      <w:r>
-        <w:rPr>
-          <w:rFonts w:ascii="Verdana" w:hAnsi="Verdana"/>
-          <w:color w:val="000000"/>
-          <w:position w:val="0"/>
-          <w:sz w:val="20"/>
-          <w:szCs w:val="20"/>
-        </w:rPr>
-        <w:t xml:space="preserve"> </w:t>
-      </w:r>
-      <w:r>
-        <w:rPr>
-          <w:rFonts w:ascii="Verdana" w:hAnsi="Verdana"/>
-          <w:color w:val="000000"/>
-          <w:position w:val="0"/>
-          <w:sz w:val="20"/>
-          <w:szCs w:val="20"/>
-        </w:rPr>
-        <w:t xml:space="preserve">distance en visioconférence via Google </w:t>
-      </w:r>
-      <w:proofErr w:type="spellStart"/>
-      <w:r>
-        <w:rPr>
-          <w:rFonts w:ascii="Verdana" w:hAnsi="Verdana"/>
-          <w:color w:val="000000"/>
-          <w:position w:val="0"/>
-          <w:sz w:val="20"/>
-          <w:szCs w:val="20"/>
-        </w:rPr>
-        <w:t>Meet</w:t>
-      </w:r>
-      <w:proofErr w:type="spellEnd"/>
-      <w:r>
-        <w:rPr>
-          <w:rFonts w:ascii="Verdana" w:hAnsi="Verdana"/>
-          <w:color w:val="000000"/>
-          <w:position w:val="0"/>
-          <w:sz w:val="20"/>
-          <w:szCs w:val="20"/>
-        </w:rPr>
-        <w:t>.</w:t>
-      </w:r>
-      <w:r>
-        <w:rPr>
-          <w:rFonts w:ascii="Verdana" w:hAnsi="Verdana"/>
-          <w:color w:val="000000"/>
-          <w:position w:val="0"/>
-          <w:sz w:val="20"/>
-          <w:szCs w:val="20"/>
-        </w:rPr>
-        <w:t xml:space="preserve"> </w:t>
-      </w:r>
-      <w:r>
-        <w:rPr>
-          <w:rFonts w:ascii="Verdana" w:hAnsi="Verdana"/>
-          <w:color w:val="000000"/>
-          <w:position w:val="0"/>
-          <w:sz w:val="20"/>
-          <w:szCs w:val="20"/>
-        </w:rPr>
-        <w:t>L</w:t>
-      </w:r>
-      <w:r>
-        <w:rPr>
-          <w:rFonts w:ascii="Verdana" w:hAnsi="Verdana"/>
-          <w:color w:val="000000"/>
-          <w:position w:val="0"/>
-          <w:sz w:val="20"/>
-          <w:szCs w:val="20"/>
-        </w:rPr>
-        <w:t>e</w:t>
-      </w:r>
-      <w:r>
-        <w:rPr>
-          <w:rFonts w:ascii="Verdana" w:hAnsi="Verdana"/>
-          <w:color w:val="000000"/>
-          <w:position w:val="0"/>
-          <w:sz w:val="20"/>
-          <w:szCs w:val="20"/>
-        </w:rPr>
-        <w:t>s</w:t>
-      </w:r>
-      <w:r>
-        <w:rPr>
-          <w:rFonts w:ascii="Verdana" w:hAnsi="Verdana"/>
-          <w:color w:val="000000"/>
-          <w:position w:val="0"/>
-          <w:sz w:val="20"/>
-          <w:szCs w:val="20"/>
-        </w:rPr>
-        <w:t xml:space="preserve"> stagiaire</w:t>
-      </w:r>
-      <w:r>
-        <w:rPr>
-          <w:rFonts w:ascii="Verdana" w:hAnsi="Verdana"/>
-          <w:color w:val="000000"/>
-          <w:position w:val="0"/>
-          <w:sz w:val="20"/>
-          <w:szCs w:val="20"/>
-        </w:rPr>
-        <w:t>s</w:t>
-      </w:r>
-      <w:r>
-        <w:rPr>
-          <w:rFonts w:ascii="Verdana" w:hAnsi="Verdana"/>
-          <w:color w:val="000000"/>
-          <w:position w:val="0"/>
-          <w:sz w:val="20"/>
-          <w:szCs w:val="20"/>
-        </w:rPr>
-        <w:t xml:space="preserve"> pourr</w:t>
-      </w:r>
-      <w:r>
-        <w:rPr>
-          <w:rFonts w:ascii="Verdana" w:hAnsi="Verdana"/>
-          <w:color w:val="000000"/>
-          <w:position w:val="0"/>
-          <w:sz w:val="20"/>
-          <w:szCs w:val="20"/>
-        </w:rPr>
-        <w:t>ont</w:t>
-      </w:r>
-      <w:r>
-        <w:rPr>
-          <w:rFonts w:ascii="Verdana" w:hAnsi="Verdana"/>
-          <w:color w:val="000000"/>
-          <w:position w:val="0"/>
-          <w:sz w:val="20"/>
-          <w:szCs w:val="20"/>
-        </w:rPr>
-        <w:t xml:space="preserve"> </w:t>
-      </w:r>
-      <w:r>
-        <w:rPr>
-          <w:rFonts w:ascii="Verdana" w:hAnsi="Verdana"/>
-          <w:color w:val="000000"/>
-          <w:position w:val="0"/>
-          <w:sz w:val="20"/>
-          <w:szCs w:val="20"/>
-        </w:rPr>
-        <w:t>ainsi</w:t>
-      </w:r>
-      <w:r>
-        <w:rPr>
-          <w:rFonts w:ascii="Verdana" w:hAnsi="Verdana"/>
-          <w:color w:val="000000"/>
-          <w:position w:val="0"/>
-          <w:sz w:val="20"/>
-          <w:szCs w:val="20"/>
-        </w:rPr>
-        <w:t xml:space="preserve"> solliciter</w:t>
-      </w:r>
-      <w:r>
-        <w:rPr>
-          <w:rFonts w:ascii="Verdana" w:hAnsi="Verdana"/>
-          <w:color w:val="000000"/>
-          <w:position w:val="0"/>
-          <w:sz w:val="20"/>
-          <w:szCs w:val="20"/>
-        </w:rPr>
-        <w:t xml:space="preserve"> la formatrice</w:t>
-      </w:r>
-      <w:r>
-        <w:rPr>
-          <w:rFonts w:ascii="Verdana" w:hAnsi="Verdana"/>
-          <w:color w:val="000000"/>
-          <w:position w:val="0"/>
-          <w:sz w:val="20"/>
-          <w:szCs w:val="20"/>
-        </w:rPr>
-        <w:t xml:space="preserve"> à tout moment pendant les heures de formation pour </w:t>
-      </w:r>
-      <w:r>
-        <w:rPr>
-          <w:rFonts w:ascii="Verdana" w:hAnsi="Verdana"/>
-          <w:color w:val="000000"/>
-          <w:position w:val="0"/>
-          <w:sz w:val="20"/>
-          <w:szCs w:val="20"/>
-        </w:rPr>
-        <w:t>toute</w:t>
-      </w:r>
-      <w:r>
-        <w:rPr>
-          <w:rFonts w:ascii="Verdana" w:hAnsi="Verdana"/>
-          <w:color w:val="000000"/>
-          <w:position w:val="0"/>
-          <w:sz w:val="20"/>
-          <w:szCs w:val="20"/>
-        </w:rPr>
-        <w:t xml:space="preserve"> question pédagogique afin d’obtenir une aide immédiate en vue du bon déroulement de l’action de formation</w:t>
-      </w:r>
-      <w:r>
-        <w:rPr>
-          <w:rFonts w:ascii="Verdana" w:hAnsi="Verdana"/>
-          <w:color w:val="000000"/>
-          <w:position w:val="0"/>
-          <w:sz w:val="20"/>
-          <w:szCs w:val="20"/>
-        </w:rPr>
-        <w:t>.</w:t>
+        <w:t>{{MODALITES_DEROULEMENT_TEXTE}}</w:t>
+      </w:r>
+      <w:r>
+        <w:rPr>
+          <w:rFonts w:ascii="Verdana" w:hAnsi="Verdana"/>
+          <w:color w:val="000000"/>
+          <w:position w:val="0"/>
+          <w:sz w:val="20"/>
+          <w:szCs w:val="20"/>
+        </w:rPr>
+      </w:r>
+      <w:r>
+        <w:rPr>
+          <w:rFonts w:ascii="Verdana" w:hAnsi="Verdana"/>
+          <w:color w:val="000000"/>
+          <w:position w:val="0"/>
+          <w:sz w:val="20"/>
+          <w:szCs w:val="20"/>
+        </w:rPr>
+      </w:r>
+      <w:r>
+        <w:rPr>
+          <w:rFonts w:ascii="Verdana" w:hAnsi="Verdana"/>
+          <w:color w:val="000000"/>
+          <w:position w:val="0"/>
+          <w:sz w:val="20"/>
+          <w:szCs w:val="20"/>
+        </w:rPr>
+      </w:r>
+      <w:r>
+        <w:rPr>
+          <w:rFonts w:ascii="Verdana" w:hAnsi="Verdana"/>
+          <w:color w:val="000000"/>
+          <w:position w:val="0"/>
+          <w:sz w:val="20"/>
+          <w:szCs w:val="20"/>
+        </w:rPr>
+      </w:r>
+      <w:r>
+        <w:rPr>
+          <w:rFonts w:ascii="Verdana" w:hAnsi="Verdana"/>
+          <w:color w:val="000000"/>
+          <w:position w:val="0"/>
+          <w:sz w:val="20"/>
+          <w:szCs w:val="20"/>
+        </w:rPr>
+      </w:r>
+      <w:r>
+        <w:rPr>
+          <w:rFonts w:ascii="Verdana" w:hAnsi="Verdana"/>
+          <w:color w:val="000000"/>
+          <w:position w:val="0"/>
+          <w:sz w:val="20"/>
+          <w:szCs w:val="20"/>
+        </w:rPr>
+      </w:r>
+      <w:r>
+        <w:rPr>
+          <w:rFonts w:ascii="Verdana" w:hAnsi="Verdana"/>
+          <w:color w:val="000000"/>
+          <w:position w:val="0"/>
+          <w:sz w:val="20"/>
+          <w:szCs w:val="20"/>
+        </w:rPr>
+      </w:r>
+      <w:r>
+        <w:rPr>
+          <w:rFonts w:ascii="Verdana" w:hAnsi="Verdana"/>
+          <w:color w:val="000000"/>
+          <w:position w:val="0"/>
+          <w:sz w:val="20"/>
+          <w:szCs w:val="20"/>
+        </w:rPr>
+      </w:r>
+      <w:r>
+        <w:rPr>
+          <w:rFonts w:ascii="Verdana" w:hAnsi="Verdana"/>
+          <w:color w:val="000000"/>
+          <w:position w:val="0"/>
+          <w:sz w:val="20"/>
+          <w:szCs w:val="20"/>
+        </w:rPr>
+      </w:r>
+      <w:r>
+        <w:rPr>
+          <w:rFonts w:ascii="Verdana" w:hAnsi="Verdana"/>
+          <w:color w:val="000000"/>
+          <w:position w:val="0"/>
+          <w:sz w:val="20"/>
+          <w:szCs w:val="20"/>
+        </w:rPr>
+      </w:r>
+      <w:r>
+        <w:rPr>
+          <w:rFonts w:ascii="Verdana" w:hAnsi="Verdana"/>
+          <w:color w:val="000000"/>
+          <w:position w:val="0"/>
+          <w:sz w:val="20"/>
+          <w:szCs w:val="20"/>
+        </w:rPr>
+      </w:r>
+      <w:r>
+        <w:rPr>
+          <w:rFonts w:ascii="Verdana" w:hAnsi="Verdana"/>
+          <w:color w:val="000000"/>
+          <w:position w:val="0"/>
+          <w:sz w:val="20"/>
+          <w:szCs w:val="20"/>
+        </w:rPr>
+      </w:r>
+      <w:r>
+        <w:rPr>
+          <w:rFonts w:ascii="Verdana" w:hAnsi="Verdana"/>
+          <w:color w:val="000000"/>
+          <w:position w:val="0"/>
+          <w:sz w:val="20"/>
+          <w:szCs w:val="20"/>
+        </w:rPr>
+      </w:r>
+      <w:r>
+        <w:rPr>
+          <w:rFonts w:ascii="Verdana" w:hAnsi="Verdana"/>
+          <w:color w:val="000000"/>
+          <w:position w:val="0"/>
+          <w:sz w:val="20"/>
+          <w:szCs w:val="20"/>
+        </w:rPr>
+      </w:r>
+      <w:r>
+        <w:rPr>
+          <w:rFonts w:ascii="Verdana" w:hAnsi="Verdana"/>
+          <w:color w:val="000000"/>
+          <w:position w:val="0"/>
+          <w:sz w:val="20"/>
+          <w:szCs w:val="20"/>
+        </w:rPr>
+      </w:r>
+      <w:r>
+        <w:rPr>
+          <w:rFonts w:ascii="Verdana" w:hAnsi="Verdana"/>
+          <w:color w:val="000000"/>
+          <w:position w:val="0"/>
+          <w:sz w:val="20"/>
+          <w:szCs w:val="20"/>
+        </w:rPr>
+      </w:r>
+      <w:r>
+        <w:rPr>
+          <w:rFonts w:ascii="Verdana" w:hAnsi="Verdana"/>
+          <w:color w:val="000000"/>
+          <w:position w:val="0"/>
+          <w:sz w:val="20"/>
+          <w:szCs w:val="20"/>
+        </w:rPr>
+      </w:r>
+      <w:r>
+        <w:rPr>
+          <w:rFonts w:ascii="Verdana" w:hAnsi="Verdana"/>
+          <w:color w:val="000000"/>
+          <w:position w:val="0"/>
+          <w:sz w:val="20"/>
+          <w:szCs w:val="20"/>
+        </w:rPr>
+      </w:r>
+      <w:r>
+        <w:rPr>
+          <w:rFonts w:ascii="Verdana" w:hAnsi="Verdana"/>
+          <w:color w:val="000000"/>
+          <w:position w:val="0"/>
+          <w:sz w:val="20"/>
+          <w:szCs w:val="20"/>
+        </w:rPr>
+      </w:r>
+      <w:r>
+        <w:rPr>
+          <w:rFonts w:ascii="Verdana" w:hAnsi="Verdana"/>
+          <w:color w:val="000000"/>
+          <w:position w:val="0"/>
+          <w:sz w:val="20"/>
+          <w:szCs w:val="20"/>
+        </w:rPr>
+      </w:r>
+      <w:r>
+        <w:rPr>
+          <w:rFonts w:ascii="Verdana" w:hAnsi="Verdana"/>
+          <w:color w:val="000000"/>
+          <w:position w:val="0"/>
+          <w:sz w:val="20"/>
+          <w:szCs w:val="20"/>
+        </w:rPr>
+      </w:r>
+      <w:r>
+        <w:rPr>
+          <w:rFonts w:ascii="Verdana" w:hAnsi="Verdana"/>
+          <w:color w:val="000000"/>
+          <w:position w:val="0"/>
+          <w:sz w:val="20"/>
+          <w:szCs w:val="20"/>
+        </w:rPr>
+      </w:r>
+      <w:r>
+        <w:rPr>
+          <w:rFonts w:ascii="Verdana" w:hAnsi="Verdana"/>
+          <w:color w:val="000000"/>
+          <w:position w:val="0"/>
+          <w:sz w:val="20"/>
+          <w:szCs w:val="20"/>
+        </w:rPr>
+      </w:r>
+      <w:r>
+        <w:rPr>
+          <w:rFonts w:ascii="Verdana" w:hAnsi="Verdana"/>
+          <w:color w:val="000000"/>
+          <w:position w:val="0"/>
+          <w:sz w:val="20"/>
+          <w:szCs w:val="20"/>
+        </w:rPr>
+      </w:r>
+      <w:r>
+        <w:rPr>
+          <w:rFonts w:ascii="Verdana" w:hAnsi="Verdana"/>
+          <w:color w:val="000000"/>
+          <w:position w:val="0"/>
+          <w:sz w:val="20"/>
+          <w:szCs w:val="20"/>
+        </w:rPr>
       </w:r>
     </w:p>
     <w:p>
@@ -3592,7 +3418,7 @@
           <w:sz w:val="20"/>
           <w:szCs w:val="20"/>
         </w:rPr>
-        <w:t>• Feuilles d'émargement signées par les stagiaires</w:t>
+        <w:t>• {{SUIVI_EMARGEMENT_TEXTE}}</w:t>
       </w:r>
     </w:p>
     <w:p>
@@ -3617,25 +3443,23 @@
           <w:sz w:val="20"/>
           <w:szCs w:val="20"/>
         </w:rPr>
-        <w:t xml:space="preserve">• Relevés de connexion </w:t>
-      </w:r>
-      <w:r>
-        <w:rPr>
-          <w:rFonts w:ascii="Verdana" w:hAnsi="Verdana"/>
-          <w:position w:val="0"/>
-          <w:sz w:val="20"/>
-          <w:szCs w:val="20"/>
-        </w:rPr>
-        <w:t>à</w:t>
-      </w:r>
-      <w:r>
-        <w:rPr>
-          <w:rFonts w:ascii="Verdana" w:hAnsi="Verdana"/>
-          <w:position w:val="0"/>
-          <w:sz w:val="20"/>
-          <w:szCs w:val="20"/>
-        </w:rPr>
-        <w:t xml:space="preserve"> la visioconférence</w:t>
+        <w:t>• {{SUIVI_MODALITE_TEXTE}}</w:t>
+      </w:r>
+      <w:r>
+        <w:rPr>
+          <w:rFonts w:ascii="Verdana" w:hAnsi="Verdana"/>
+          <w:position w:val="0"/>
+          <w:sz w:val="20"/>
+          <w:szCs w:val="20"/>
+        </w:rPr>
+      </w:r>
+      <w:r>
+        <w:rPr>
+          <w:rFonts w:ascii="Verdana" w:hAnsi="Verdana"/>
+          <w:position w:val="0"/>
+          <w:sz w:val="20"/>
+          <w:szCs w:val="20"/>
+        </w:rPr>
       </w:r>
     </w:p>
     <w:p>
@@ -3792,7 +3616,7 @@
           <w:sz w:val="20"/>
           <w:szCs w:val="20"/>
         </w:rPr>
-        <w:t>En application de l’article L.6313-7 du Code du travail, Les autres formations peuvent faire l'objet d'une attestation dont le titulaire peut se prévaloir. </w:t>
+        <w:t>En application de l’article L.6313-7 du Code du travail, les autres formations peuvent faire l’objet d’une attestation dont le titulaire peut se prévaloir.</w:t>
       </w:r>
     </w:p>
     <w:p>
@@ -3829,7 +3653,7 @@
           <w:sz w:val="20"/>
           <w:szCs w:val="20"/>
         </w:rPr>
-        <w:t>Une attestation mentionnant les objectifs, la nature et la durée de l’action et les résultats de l’évaluation des acquis de la formation sera remise à l’issue de la formation</w:t>
+        <w:t>Une attestation mentionnant les objectifs, la nature et la durée de l’action ainsi que les résultats de l’évaluation des acquis sera remise à chaque participant à l’issue de la formation.</w:t>
       </w:r>
     </w:p>
     <w:p>
@@ -3854,11 +3678,6 @@
         <w:textDirection w:val="lrTb"/>
         <w:textAlignment w:val="auto"/>
         <w:outlineLvl w:val="9"/>
-        <w:rPr>
-          <w:position w:val="0"/>
-        </w:rPr>
-      </w:pPr>
-      <w:r>
         <w:rPr>
           <w:rFonts w:ascii="Verdana" w:hAnsi="Verdana"/>
           <w:b/>
@@ -3869,302 +3688,6 @@
           <w:szCs w:val="22"/>
           <w:u w:val="single"/>
         </w:rPr>
-        <w:t>Article 6 : Modalités de règlement</w:t>
-      </w:r>
-    </w:p>
-    <w:p>
-      <w:pPr>
-        <w:suppressAutoHyphens w:val="0"/>
-        <w:spacing w:line="240" w:lineRule="auto"/>
-        <w:ind w:leftChars="0" w:left="0" w:firstLineChars="0" w:firstLine="0"/>
-        <w:textDirection w:val="lrTb"/>
-        <w:textAlignment w:val="auto"/>
-        <w:outlineLvl w:val="9"/>
-        <w:rPr>
-          <w:position w:val="0"/>
-        </w:rPr>
-      </w:pPr>
-    </w:p>
-    <w:p>
-      <w:pPr>
-        <w:suppressAutoHyphens w:val="0"/>
-        <w:spacing w:line="240" w:lineRule="auto"/>
-        <w:ind w:leftChars="0" w:left="-2" w:firstLineChars="0"/>
-        <w:jc w:val="both"/>
-        <w:textDirection w:val="lrTb"/>
-        <w:textAlignment w:val="auto"/>
-        <w:outlineLvl w:val="9"/>
-        <w:rPr>
-          <w:rFonts w:ascii="Verdana" w:hAnsi="Verdana"/>
-          <w:color w:val="000000"/>
-          <w:position w:val="0"/>
-          <w:sz w:val="20"/>
-          <w:szCs w:val="20"/>
-        </w:rPr>
-      </w:pPr>
-      <w:r>
-        <w:rPr>
-          <w:rFonts w:ascii="Verdana" w:hAnsi="Verdana"/>
-          <w:color w:val="000000"/>
-          <w:position w:val="0"/>
-          <w:sz w:val="20"/>
-          <w:szCs w:val="20"/>
-        </w:rPr>
-        <w:t>Le coût de la formation, objet de la présente convention, s'élève à : {{FORMATION_PRIX}}, TVA exonérée conformément à l'article 261-4-4° du CGI, soit un montant total net de TVA de {{FORMATION_PRIX}}.</w:t>
-      </w:r>
-      <w:r>
-        <w:rPr>
-          <w:rFonts w:ascii="Verdana" w:hAnsi="Verdana"/>
-          <w:color w:val="000000"/>
-          <w:position w:val="0"/>
-          <w:sz w:val="20"/>
-          <w:szCs w:val="20"/>
-        </w:rPr>
-      </w:r>
-      <w:r>
-        <w:rPr>
-          <w:rFonts w:ascii="Verdana" w:hAnsi="Verdana"/>
-          <w:color w:val="000000"/>
-          <w:position w:val="0"/>
-          <w:sz w:val="20"/>
-          <w:szCs w:val="20"/>
-        </w:rPr>
-      </w:r>
-      <w:r>
-        <w:rPr>
-          <w:rFonts w:ascii="Verdana" w:hAnsi="Verdana"/>
-          <w:color w:val="000000"/>
-          <w:position w:val="0"/>
-          <w:sz w:val="20"/>
-          <w:szCs w:val="20"/>
-        </w:rPr>
-      </w:r>
-      <w:r>
-        <w:rPr>
-          <w:rFonts w:ascii="Verdana" w:hAnsi="Verdana"/>
-          <w:color w:val="000000"/>
-          <w:position w:val="0"/>
-          <w:sz w:val="20"/>
-          <w:szCs w:val="20"/>
-        </w:rPr>
-      </w:r>
-      <w:r>
-        <w:rPr>
-          <w:rFonts w:ascii="Verdana" w:hAnsi="Verdana"/>
-          <w:color w:val="000000"/>
-          <w:position w:val="0"/>
-          <w:sz w:val="20"/>
-          <w:szCs w:val="20"/>
-        </w:rPr>
-      </w:r>
-      <w:r>
-        <w:rPr>
-          <w:rFonts w:ascii="Verdana" w:hAnsi="Verdana"/>
-          <w:color w:val="000000"/>
-          <w:position w:val="0"/>
-          <w:sz w:val="20"/>
-          <w:szCs w:val="20"/>
-        </w:rPr>
-      </w:r>
-      <w:r>
-        <w:rPr>
-          <w:rFonts w:ascii="Verdana" w:hAnsi="Verdana"/>
-          <w:color w:val="000000"/>
-          <w:position w:val="0"/>
-          <w:sz w:val="20"/>
-          <w:szCs w:val="20"/>
-        </w:rPr>
-      </w:r>
-      <w:r>
-        <w:rPr>
-          <w:rFonts w:ascii="Verdana" w:hAnsi="Verdana"/>
-          <w:color w:val="000000"/>
-          <w:position w:val="0"/>
-          <w:sz w:val="20"/>
-          <w:szCs w:val="20"/>
-        </w:rPr>
-      </w:r>
-      <w:r>
-        <w:rPr>
-          <w:rFonts w:ascii="Verdana" w:hAnsi="Verdana"/>
-          <w:color w:val="000000"/>
-          <w:position w:val="0"/>
-          <w:sz w:val="20"/>
-          <w:szCs w:val="20"/>
-        </w:rPr>
-      </w:r>
-      <w:r>
-        <w:rPr>
-          <w:rFonts w:ascii="Verdana" w:hAnsi="Verdana"/>
-          <w:color w:val="000000"/>
-          <w:position w:val="0"/>
-          <w:sz w:val="20"/>
-          <w:szCs w:val="20"/>
-        </w:rPr>
-      </w:r>
-      <w:r>
-        <w:rPr>
-          <w:rFonts w:ascii="Verdana" w:hAnsi="Verdana"/>
-          <w:color w:val="000000"/>
-          <w:position w:val="0"/>
-          <w:sz w:val="20"/>
-          <w:szCs w:val="20"/>
-        </w:rPr>
-      </w:r>
-      <w:r>
-        <w:rPr>
-          <w:rFonts w:ascii="Verdana" w:hAnsi="Verdana"/>
-          <w:color w:val="000000"/>
-          <w:position w:val="0"/>
-          <w:sz w:val="20"/>
-          <w:szCs w:val="20"/>
-        </w:rPr>
-      </w:r>
-    </w:p>
-    <w:p>
-      <w:pPr>
-        <w:suppressAutoHyphens w:val="0"/>
-        <w:spacing w:line="240" w:lineRule="auto"/>
-        <w:ind w:leftChars="0" w:left="-2" w:firstLineChars="0"/>
-        <w:jc w:val="both"/>
-        <w:textDirection w:val="lrTb"/>
-        <w:textAlignment w:val="auto"/>
-        <w:outlineLvl w:val="9"/>
-        <w:rPr>
-          <w:rFonts w:ascii="Verdana" w:hAnsi="Verdana"/>
-          <w:color w:val="000000"/>
-          <w:position w:val="0"/>
-          <w:sz w:val="20"/>
-          <w:szCs w:val="20"/>
-        </w:rPr>
-      </w:pPr>
-    </w:p>
-    <w:p>
-      <w:pPr>
-        <w:suppressAutoHyphens w:val="0"/>
-        <w:spacing w:line="240" w:lineRule="auto"/>
-        <w:ind w:leftChars="0" w:left="-2" w:firstLineChars="0"/>
-        <w:jc w:val="both"/>
-        <w:textDirection w:val="lrTb"/>
-        <w:textAlignment w:val="auto"/>
-        <w:outlineLvl w:val="9"/>
-        <w:rPr>
-          <w:rFonts w:ascii="Verdana" w:hAnsi="Verdana"/>
-          <w:color w:val="000000"/>
-          <w:position w:val="0"/>
-          <w:sz w:val="20"/>
-          <w:szCs w:val="20"/>
-        </w:rPr>
-      </w:pPr>
-      <w:r>
-        <w:rPr>
-          <w:rFonts w:ascii="Verdana" w:hAnsi="Verdana"/>
-          <w:color w:val="000000"/>
-          <w:position w:val="0"/>
-          <w:sz w:val="20"/>
-          <w:szCs w:val="20"/>
-        </w:rPr>
-        <w:t>Cette somme couvre l'intégralité des frais engagés par l'organisme de formation pour cette session.</w:t>
-      </w:r>
-    </w:p>
-    <w:p>
-      <w:pPr>
-        <w:suppressAutoHyphens w:val="0"/>
-        <w:spacing w:line="240" w:lineRule="auto"/>
-        <w:ind w:leftChars="0" w:left="-2" w:firstLineChars="0"/>
-        <w:jc w:val="both"/>
-        <w:textDirection w:val="lrTb"/>
-        <w:textAlignment w:val="auto"/>
-        <w:outlineLvl w:val="9"/>
-        <w:rPr>
-          <w:rFonts w:ascii="Verdana" w:hAnsi="Verdana"/>
-          <w:color w:val="000000"/>
-          <w:position w:val="0"/>
-          <w:sz w:val="20"/>
-          <w:szCs w:val="20"/>
-        </w:rPr>
-      </w:pPr>
-    </w:p>
-    <w:p>
-      <w:pPr>
-        <w:suppressAutoHyphens w:val="0"/>
-        <w:spacing w:line="240" w:lineRule="auto"/>
-        <w:ind w:leftChars="0" w:left="-2" w:firstLineChars="0" w:hanging="2"/>
-        <w:jc w:val="both"/>
-        <w:textDirection w:val="lrTb"/>
-        <w:textAlignment w:val="auto"/>
-        <w:outlineLvl w:val="9"/>
-        <w:rPr>
-          <w:rFonts w:ascii="Verdana" w:hAnsi="Verdana"/>
-          <w:color w:val="000000"/>
-          <w:position w:val="0"/>
-          <w:sz w:val="20"/>
-          <w:szCs w:val="20"/>
-        </w:rPr>
-      </w:pPr>
-      <w:r>
-        <w:rPr>
-          <w:rFonts w:ascii="Verdana" w:hAnsi="Verdana"/>
-          <w:color w:val="000000"/>
-          <w:position w:val="0"/>
-          <w:sz w:val="20"/>
-          <w:szCs w:val="20"/>
-        </w:rPr>
-        <w:t xml:space="preserve">Le règlement devra être effectue </w:t>
-      </w:r>
-      <w:r>
-        <w:rPr>
-          <w:rFonts w:ascii="Verdana" w:hAnsi="Verdana"/>
-          <w:color w:val="000000"/>
-          <w:position w:val="0"/>
-          <w:sz w:val="20"/>
-          <w:szCs w:val="20"/>
-        </w:rPr>
-        <w:t>à</w:t>
-      </w:r>
-      <w:r>
-        <w:rPr>
-          <w:rFonts w:ascii="Verdana" w:hAnsi="Verdana"/>
-          <w:color w:val="000000"/>
-          <w:position w:val="0"/>
-          <w:sz w:val="20"/>
-          <w:szCs w:val="20"/>
-        </w:rPr>
-        <w:t xml:space="preserve"> </w:t>
-      </w:r>
-      <w:r>
-        <w:rPr>
-          <w:rFonts w:ascii="Verdana" w:hAnsi="Verdana"/>
-          <w:color w:val="000000"/>
-          <w:position w:val="0"/>
-          <w:sz w:val="20"/>
-          <w:szCs w:val="20"/>
-        </w:rPr>
-        <w:t>réc</w:t>
-      </w:r>
-      <w:r>
-        <w:rPr>
-          <w:rFonts w:ascii="Verdana" w:hAnsi="Verdana"/>
-          <w:color w:val="000000"/>
-          <w:position w:val="0"/>
-          <w:sz w:val="20"/>
-          <w:szCs w:val="20"/>
-        </w:rPr>
-        <w:t>eption de facture, sous un délai de 30 jours, par virement bancaire.</w:t>
-      </w:r>
-    </w:p>
-    <w:p>
-      <w:pPr>
-        <w:suppressAutoHyphens w:val="0"/>
-        <w:spacing w:line="240" w:lineRule="auto"/>
-        <w:ind w:leftChars="0" w:left="-2" w:firstLineChars="0" w:hanging="2"/>
-        <w:jc w:val="both"/>
-        <w:textDirection w:val="lrTb"/>
-        <w:textAlignment w:val="auto"/>
-        <w:outlineLvl w:val="9"/>
-        <w:rPr>
-          <w:position w:val="0"/>
-        </w:rPr>
       </w:pPr>
     </w:p>
     <w:p>
@@ -4198,11 +3721,6 @@
         <w:textAlignment w:val="auto"/>
         <w:outlineLvl w:val="9"/>
         <w:rPr>
-          <w:position w:val="0"/>
-        </w:rPr>
-      </w:pPr>
-      <w:r>
-        <w:rPr>
           <w:rFonts w:ascii="Verdana" w:hAnsi="Verdana"/>
           <w:b/>
           <w:bCs/>
@@ -4212,77 +3730,6 @@
           <w:szCs w:val="22"/>
           <w:u w:val="single"/>
         </w:rPr>
-        <w:lastRenderedPageBreak/>
-        <w:t>Article 7 : Dédit ou abandon</w:t>
-      </w:r>
-    </w:p>
-    <w:p>
-      <w:pPr>
-        <w:suppressAutoHyphens w:val="0"/>
-        <w:spacing w:line="240" w:lineRule="auto"/>
-        <w:ind w:leftChars="0" w:left="0" w:firstLineChars="0" w:firstLine="0"/>
-        <w:textDirection w:val="lrTb"/>
-        <w:textAlignment w:val="auto"/>
-        <w:outlineLvl w:val="9"/>
-        <w:rPr>
-          <w:position w:val="0"/>
-        </w:rPr>
-      </w:pPr>
-    </w:p>
-    <w:p>
-      <w:pPr>
-        <w:suppressAutoHyphens w:val="0"/>
-        <w:spacing w:line="240" w:lineRule="auto"/>
-        <w:ind w:leftChars="0" w:left="-2" w:firstLineChars="0" w:hanging="2"/>
-        <w:jc w:val="both"/>
-        <w:textDirection w:val="lrTb"/>
-        <w:textAlignment w:val="auto"/>
-        <w:outlineLvl w:val="9"/>
-        <w:rPr>
-          <w:position w:val="0"/>
-        </w:rPr>
-      </w:pPr>
-      <w:r>
-        <w:rPr>
-          <w:rFonts w:ascii="Verdana" w:hAnsi="Verdana"/>
-          <w:color w:val="000000"/>
-          <w:position w:val="0"/>
-          <w:sz w:val="20"/>
-          <w:szCs w:val="20"/>
-        </w:rPr>
-        <w:t>En cas de dédit par l’entreprise à moin</w:t>
-      </w:r>
-      <w:r>
-        <w:rPr>
-          <w:rFonts w:ascii="Verdana" w:hAnsi="Verdana"/>
-          <w:position w:val="0"/>
-          <w:sz w:val="20"/>
-          <w:szCs w:val="20"/>
-        </w:rPr>
-        <w:t xml:space="preserve">s de 7 jours francs </w:t>
-      </w:r>
-      <w:r>
-        <w:rPr>
-          <w:rFonts w:ascii="Verdana" w:hAnsi="Verdana"/>
-          <w:color w:val="000000"/>
-          <w:position w:val="0"/>
-          <w:sz w:val="20"/>
-          <w:szCs w:val="20"/>
-        </w:rPr>
-        <w:t>avant le début de l’action mentionnée à l’article 1, ou d’abandon en cours de formation par un ou plusieurs stagiaires, l’organisme remboursera sur le coût total, les sommes qu’il n’aura pas réellement dépensées ou engagées pour la réalisation de ladite action. </w:t>
-      </w:r>
-    </w:p>
-    <w:p>
-      <w:pPr>
-        <w:suppressAutoHyphens w:val="0"/>
-        <w:spacing w:line="240" w:lineRule="auto"/>
-        <w:ind w:leftChars="0" w:left="0" w:firstLineChars="0" w:firstLine="0"/>
-        <w:textDirection w:val="lrTb"/>
-        <w:textAlignment w:val="auto"/>
-        <w:outlineLvl w:val="9"/>
-        <w:rPr>
-          <w:position w:val="0"/>
-        </w:rPr>
       </w:pPr>
     </w:p>
     <w:p>
@@ -4337,11 +3784,6 @@
         <w:textAlignment w:val="auto"/>
         <w:outlineLvl w:val="9"/>
         <w:rPr>
-          <w:position w:val="0"/>
-        </w:rPr>
-      </w:pPr>
-      <w:r>
-        <w:rPr>
           <w:rFonts w:ascii="Verdana" w:hAnsi="Verdana"/>
           <w:b/>
           <w:bCs/>
@@ -4351,226 +3793,55 @@
           <w:szCs w:val="22"/>
           <w:u w:val="single"/>
         </w:rPr>
-        <w:t>Article 8 : Différends éventuels </w:t>
-      </w:r>
-    </w:p>
-    <w:p>
-      <w:pPr>
-        <w:suppressAutoHyphens w:val="0"/>
-        <w:spacing w:line="240" w:lineRule="auto"/>
-        <w:ind w:leftChars="0" w:left="0" w:firstLineChars="0" w:firstLine="0"/>
-        <w:textDirection w:val="lrTb"/>
-        <w:textAlignment w:val="auto"/>
-        <w:outlineLvl w:val="9"/>
-        <w:rPr>
-          <w:position w:val="0"/>
-        </w:rPr>
-      </w:pPr>
-    </w:p>
-    <w:p>
-      <w:pPr>
-        <w:suppressAutoHyphens w:val="0"/>
-        <w:spacing w:line="240" w:lineRule="auto"/>
-        <w:ind w:leftChars="0" w:left="-2" w:firstLineChars="0" w:hanging="2"/>
-        <w:jc w:val="both"/>
-        <w:textDirection w:val="lrTb"/>
-        <w:textAlignment w:val="auto"/>
-        <w:outlineLvl w:val="9"/>
-        <w:rPr>
-          <w:position w:val="0"/>
-        </w:rPr>
-      </w:pPr>
-      <w:r>
-        <w:rPr>
-          <w:rFonts w:ascii="Verdana" w:hAnsi="Verdana"/>
-          <w:color w:val="000000"/>
-          <w:position w:val="0"/>
-          <w:sz w:val="20"/>
-          <w:szCs w:val="20"/>
-        </w:rPr>
-        <w:t xml:space="preserve">Si une contestation ou un différend ne peuvent être réglés à l’amiable, le </w:t>
-      </w:r>
-      <w:r>
-        <w:rPr>
-          <w:rFonts w:ascii="Verdana" w:hAnsi="Verdana"/>
-          <w:position w:val="0"/>
-          <w:sz w:val="20"/>
-          <w:szCs w:val="20"/>
-        </w:rPr>
-        <w:t xml:space="preserve">Tribunal de Lille sera </w:t>
-      </w:r>
-      <w:r>
-        <w:rPr>
-          <w:rFonts w:ascii="Verdana" w:hAnsi="Verdana"/>
-          <w:color w:val="000000"/>
-          <w:position w:val="0"/>
-          <w:sz w:val="20"/>
-          <w:szCs w:val="20"/>
-        </w:rPr>
-        <w:t>seul compétent pour régler le litige.</w:t>
-      </w:r>
-    </w:p>
-    <w:p>
-      <w:pPr>
-        <w:suppressAutoHyphens w:val="0"/>
-        <w:spacing w:line="240" w:lineRule="auto"/>
-        <w:ind w:leftChars="0" w:left="0" w:firstLineChars="0" w:firstLine="0"/>
-        <w:textDirection w:val="lrTb"/>
-        <w:textAlignment w:val="auto"/>
-        <w:outlineLvl w:val="9"/>
-        <w:rPr>
-          <w:position w:val="0"/>
-        </w:rPr>
-      </w:pPr>
-    </w:p>
-    <w:p>
-      <w:pPr>
-        <w:suppressAutoHyphens w:val="0"/>
-        <w:spacing w:line="240" w:lineRule="auto"/>
-        <w:ind w:leftChars="0" w:left="-2" w:firstLineChars="0" w:hanging="2"/>
-        <w:jc w:val="both"/>
-        <w:textDirection w:val="lrTb"/>
-        <w:textAlignment w:val="auto"/>
-        <w:outlineLvl w:val="9"/>
-        <w:rPr>
-          <w:rFonts w:ascii="Verdana" w:hAnsi="Verdana"/>
-          <w:color w:val="1F497D"/>
-          <w:position w:val="0"/>
-          <w:sz w:val="20"/>
-          <w:szCs w:val="20"/>
-        </w:rPr>
-      </w:pPr>
-      <w:r>
-        <w:rPr>
-          <w:rFonts w:ascii="Verdana" w:hAnsi="Verdana"/>
-          <w:color w:val="000000"/>
-          <w:position w:val="0"/>
-          <w:sz w:val="20"/>
-          <w:szCs w:val="20"/>
-        </w:rPr>
-        <w:t xml:space="preserve">Fait en double exemplaire, à LOOS le, {{DOCUMENT_DATE}} </w:t>
-      </w:r>
-      <w:r>
-        <w:rPr>
-          <w:rFonts w:ascii="Verdana" w:hAnsi="Verdana"/>
-          <w:color w:val="000000"/>
-          <w:position w:val="0"/>
-          <w:sz w:val="20"/>
-          <w:szCs w:val="20"/>
-        </w:rPr>
-      </w:r>
-      <w:r>
-        <w:rPr>
-          <w:rFonts w:ascii="Verdana" w:hAnsi="Verdana"/>
-          <w:position w:val="0"/>
-          <w:sz w:val="20"/>
-          <w:szCs w:val="20"/>
-        </w:rPr>
-      </w:r>
-      <w:r>
+      </w:pPr>
+    </w:p>
+    <w:p>
+      <w:pPr>
+        <w:suppressAutoHyphens w:val="0"/>
+        <w:spacing w:line="240" w:lineRule="auto"/>
+        <w:ind w:leftChars="0" w:left="-2" w:firstLineChars="0" w:hanging="2"/>
+        <w:jc w:val="both"/>
+        <w:textDirection w:val="lrTb"/>
+        <w:textAlignment w:val="auto"/>
+        <w:outlineLvl w:val="9"/>
         <w:rPr>
           <w:rFonts w:ascii="Verdana" w:hAnsi="Verdana"/>
           <w:b/>
           <w:bCs/>
-          <w:position w:val="0"/>
-          <w:sz w:val="20"/>
-          <w:szCs w:val="20"/>
-        </w:rPr>
-      </w:r>
-      <w:r>
-        <w:rPr>
-          <w:rFonts w:ascii="Verdana" w:hAnsi="Verdana"/>
-          <w:position w:val="0"/>
-          <w:sz w:val="20"/>
-          <w:szCs w:val="20"/>
-        </w:rPr>
-      </w:r>
+          <w:color w:val="000000"/>
+          <w:position w:val="0"/>
+          <w:sz w:val="22"/>
+          <w:szCs w:val="22"/>
+          <w:u w:val="single"/>
+        </w:rPr>
+      </w:pPr>
+    </w:p>
+    <w:p>
+      <w:pPr>
+        <w:suppressAutoHyphens w:val="0"/>
+        <w:spacing w:line="240" w:lineRule="auto"/>
+        <w:ind w:leftChars="0" w:left="-2" w:firstLineChars="0" w:hanging="2"/>
+        <w:jc w:val="both"/>
+        <w:textDirection w:val="lrTb"/>
+        <w:textAlignment w:val="auto"/>
+        <w:outlineLvl w:val="9"/>
+        <w:rPr>
+          <w:position w:val="0"/>
+        </w:rPr>
+      </w:pPr>
       <w:r>
         <w:rPr>
           <w:rFonts w:ascii="Verdana" w:hAnsi="Verdana"/>
           <w:b/>
           <w:bCs/>
-          <w:position w:val="0"/>
-          <w:sz w:val="20"/>
-          <w:szCs w:val="20"/>
-        </w:rPr>
-      </w:r>
-      <w:r>
-        <w:rPr>
-          <w:rFonts w:ascii="Verdana" w:hAnsi="Verdana"/>
-          <w:position w:val="0"/>
-          <w:sz w:val="20"/>
-          <w:szCs w:val="20"/>
-        </w:rPr>
-      </w:r>
-    </w:p>
-    <w:p>
-      <w:pPr>
-        <w:suppressAutoHyphens w:val="0"/>
-        <w:spacing w:line="240" w:lineRule="auto"/>
-        <w:ind w:leftChars="0" w:left="-2" w:firstLineChars="0" w:hanging="2"/>
-        <w:jc w:val="both"/>
-        <w:textDirection w:val="lrTb"/>
-        <w:textAlignment w:val="auto"/>
-        <w:outlineLvl w:val="9"/>
-        <w:rPr>
-          <w:rFonts w:ascii="Verdana" w:hAnsi="Verdana"/>
-          <w:color w:val="1F497D"/>
-          <w:position w:val="0"/>
-          <w:sz w:val="20"/>
-          <w:szCs w:val="20"/>
-        </w:rPr>
-      </w:pPr>
-    </w:p>
-    <w:p>
-      <w:pPr>
-        <w:suppressAutoHyphens w:val="0"/>
-        <w:spacing w:line="240" w:lineRule="auto"/>
-        <w:ind w:leftChars="0" w:left="-2" w:firstLineChars="0" w:hanging="2"/>
-        <w:jc w:val="both"/>
-        <w:textDirection w:val="lrTb"/>
-        <w:textAlignment w:val="auto"/>
-        <w:outlineLvl w:val="9"/>
-        <w:rPr>
-          <w:rFonts w:ascii="Verdana" w:hAnsi="Verdana"/>
-          <w:color w:val="1F497D"/>
-          <w:position w:val="0"/>
-          <w:sz w:val="20"/>
-          <w:szCs w:val="20"/>
-        </w:rPr>
-      </w:pPr>
-    </w:p>
-    <w:p>
-      <w:pPr>
-        <w:suppressAutoHyphens w:val="0"/>
-        <w:spacing w:line="240" w:lineRule="auto"/>
-        <w:ind w:leftChars="0" w:left="-2" w:firstLineChars="0" w:hanging="2"/>
-        <w:jc w:val="both"/>
-        <w:textDirection w:val="lrTb"/>
-        <w:textAlignment w:val="auto"/>
-        <w:outlineLvl w:val="9"/>
-        <w:rPr>
-          <w:rFonts w:ascii="Verdana" w:hAnsi="Verdana"/>
-          <w:color w:val="1F497D"/>
-          <w:position w:val="0"/>
-          <w:sz w:val="20"/>
-          <w:szCs w:val="20"/>
-        </w:rPr>
-      </w:pPr>
-    </w:p>
-    <w:p>
-      <w:pPr>
-        <w:suppressAutoHyphens w:val="0"/>
-        <w:spacing w:line="240" w:lineRule="auto"/>
-        <w:ind w:leftChars="0" w:left="-2" w:firstLineChars="0" w:hanging="2"/>
-        <w:jc w:val="both"/>
-        <w:textDirection w:val="lrTb"/>
-        <w:textAlignment w:val="auto"/>
-        <w:outlineLvl w:val="9"/>
-        <w:rPr>
-          <w:position w:val="0"/>
-        </w:rPr>
-      </w:pPr>
+          <w:color w:val="000000"/>
+          <w:position w:val="0"/>
+          <w:sz w:val="22"/>
+          <w:szCs w:val="22"/>
+          <w:u w:val="single"/>
+        </w:rPr>
+        <w:t>Article 6 : Modalités de règlement</w:t>
+      </w:r>
     </w:p>
     <w:p>
       <w:pPr>
@@ -4589,71 +3860,577 @@
       <w:pPr>
         <w:suppressAutoHyphens w:val="0"/>
         <w:spacing w:line="240" w:lineRule="auto"/>
-        <w:ind w:leftChars="0" w:left="-2" w:firstLineChars="0" w:hanging="2"/>
-        <w:jc w:val="both"/>
-        <w:textDirection w:val="lrTb"/>
-        <w:textAlignment w:val="auto"/>
-        <w:outlineLvl w:val="9"/>
-        <w:rPr>
-          <w:position w:val="0"/>
-        </w:rPr>
-      </w:pPr>
-      <w:r>
-        <w:rPr>
-          <w:rFonts w:ascii="Verdana" w:hAnsi="Verdana"/>
-          <w:color w:val="000000"/>
-          <w:position w:val="0"/>
-          <w:sz w:val="20"/>
-          <w:szCs w:val="20"/>
-        </w:rPr>
-        <w:t xml:space="preserve">Pour l’entreprise {{CLIENT_NOM}}        </w:t>
-        <w:tab/>
-        <w:tab/>
-        <w:t xml:space="preserve">        </w:t>
-      </w:r>
-      <w:r>
-        <w:rPr>
-          <w:rFonts w:ascii="Verdana" w:hAnsi="Verdana"/>
-          <w:position w:val="0"/>
-          <w:sz w:val="20"/>
-          <w:szCs w:val="20"/>
-        </w:rPr>
-      </w:r>
-      <w:r>
+        <w:ind w:leftChars="0" w:left="-2" w:firstLineChars="0"/>
+        <w:jc w:val="both"/>
+        <w:textDirection w:val="lrTb"/>
+        <w:textAlignment w:val="auto"/>
+        <w:outlineLvl w:val="9"/>
+        <w:rPr>
+          <w:rFonts w:ascii="Verdana" w:hAnsi="Verdana"/>
+          <w:color w:val="000000"/>
+          <w:position w:val="0"/>
+          <w:sz w:val="20"/>
+          <w:szCs w:val="20"/>
+        </w:rPr>
+      </w:pPr>
+      <w:r>
+        <w:rPr>
+          <w:rFonts w:ascii="Verdana" w:hAnsi="Verdana"/>
+          <w:color w:val="000000"/>
+          <w:position w:val="0"/>
+          <w:sz w:val="20"/>
+          <w:szCs w:val="20"/>
+        </w:rPr>
+        <w:t>Le coût de la formation, objet de la présente convention, s'élève à : {{FORMATION_PRIX}}, TVA exonérée conformément à l'article 261-4-4° du CGI, soit un montant total net de TVA de {{FORMATION_PRIX}}.</w:t>
+      </w:r>
+    </w:p>
+    <w:p>
+      <w:pPr>
+        <w:suppressAutoHyphens w:val="0"/>
+        <w:spacing w:line="240" w:lineRule="auto"/>
+        <w:ind w:leftChars="0" w:left="-2" w:firstLineChars="0"/>
+        <w:jc w:val="both"/>
+        <w:textDirection w:val="lrTb"/>
+        <w:textAlignment w:val="auto"/>
+        <w:outlineLvl w:val="9"/>
+        <w:rPr>
+          <w:rFonts w:ascii="Verdana" w:hAnsi="Verdana"/>
+          <w:color w:val="000000"/>
+          <w:position w:val="0"/>
+          <w:sz w:val="20"/>
+          <w:szCs w:val="20"/>
+        </w:rPr>
+      </w:pPr>
+    </w:p>
+    <w:p>
+      <w:pPr>
+        <w:suppressAutoHyphens w:val="0"/>
+        <w:spacing w:line="240" w:lineRule="auto"/>
+        <w:ind w:leftChars="0" w:left="-2" w:firstLineChars="0"/>
+        <w:jc w:val="both"/>
+        <w:textDirection w:val="lrTb"/>
+        <w:textAlignment w:val="auto"/>
+        <w:outlineLvl w:val="9"/>
+        <w:rPr>
+          <w:rFonts w:ascii="Verdana" w:hAnsi="Verdana"/>
+          <w:color w:val="000000"/>
+          <w:position w:val="0"/>
+          <w:sz w:val="20"/>
+          <w:szCs w:val="20"/>
+        </w:rPr>
+      </w:pPr>
+      <w:r>
+        <w:rPr>
+          <w:rFonts w:ascii="Verdana" w:hAnsi="Verdana"/>
+          <w:color w:val="000000"/>
+          <w:position w:val="0"/>
+          <w:sz w:val="20"/>
+          <w:szCs w:val="20"/>
+        </w:rPr>
+        <w:t>Cette somme couvre l'intégralité des frais engagés par l'organisme de formation pour cette session.</w:t>
+      </w:r>
+    </w:p>
+    <w:p>
+      <w:pPr>
+        <w:suppressAutoHyphens w:val="0"/>
+        <w:spacing w:line="240" w:lineRule="auto"/>
+        <w:ind w:leftChars="0" w:left="-2" w:firstLineChars="0"/>
+        <w:jc w:val="both"/>
+        <w:textDirection w:val="lrTb"/>
+        <w:textAlignment w:val="auto"/>
+        <w:outlineLvl w:val="9"/>
+        <w:rPr>
+          <w:rFonts w:ascii="Verdana" w:hAnsi="Verdana"/>
+          <w:color w:val="000000"/>
+          <w:position w:val="0"/>
+          <w:sz w:val="20"/>
+          <w:szCs w:val="20"/>
+        </w:rPr>
+      </w:pPr>
+    </w:p>
+    <w:p>
+      <w:pPr>
+        <w:suppressAutoHyphens w:val="0"/>
+        <w:spacing w:line="240" w:lineRule="auto"/>
+        <w:ind w:leftChars="0" w:left="-2" w:firstLineChars="0" w:hanging="2"/>
+        <w:jc w:val="both"/>
+        <w:textDirection w:val="lrTb"/>
+        <w:textAlignment w:val="auto"/>
+        <w:outlineLvl w:val="9"/>
+        <w:rPr>
+          <w:rFonts w:ascii="Verdana" w:hAnsi="Verdana"/>
+          <w:color w:val="000000"/>
+          <w:position w:val="0"/>
+          <w:sz w:val="20"/>
+          <w:szCs w:val="20"/>
+        </w:rPr>
+      </w:pPr>
+      <w:r>
+        <w:rPr>
+          <w:rFonts w:ascii="Verdana" w:hAnsi="Verdana"/>
+          <w:color w:val="000000"/>
+          <w:position w:val="0"/>
+          <w:sz w:val="20"/>
+          <w:szCs w:val="20"/>
+        </w:rPr>
+        <w:t>Le règlement devra être effectué à réception de facture, par virement bancaire, dans un délai maximal de 10 jours calendaires à compter de la date d’émission de la facture.</w:t>
+      </w:r>
+      <w:r>
+        <w:rPr>
+          <w:rFonts w:ascii="Verdana" w:hAnsi="Verdana"/>
+          <w:color w:val="000000"/>
+          <w:position w:val="0"/>
+          <w:sz w:val="20"/>
+          <w:szCs w:val="20"/>
+        </w:rPr>
+      </w:r>
+      <w:r>
+        <w:rPr>
+          <w:rFonts w:ascii="Verdana" w:hAnsi="Verdana"/>
+          <w:color w:val="000000"/>
+          <w:position w:val="0"/>
+          <w:sz w:val="20"/>
+          <w:szCs w:val="20"/>
+        </w:rPr>
+      </w:r>
+      <w:r>
+        <w:rPr>
+          <w:rFonts w:ascii="Verdana" w:hAnsi="Verdana"/>
+          <w:color w:val="000000"/>
+          <w:position w:val="0"/>
+          <w:sz w:val="20"/>
+          <w:szCs w:val="20"/>
+        </w:rPr>
+      </w:r>
+      <w:r>
+        <w:rPr>
+          <w:rFonts w:ascii="Verdana" w:hAnsi="Verdana"/>
+          <w:color w:val="000000"/>
+          <w:position w:val="0"/>
+          <w:sz w:val="20"/>
+          <w:szCs w:val="20"/>
+        </w:rPr>
+      </w:r>
+    </w:p>
+    <w:p>
+      <w:pPr>
+        <w:suppressAutoHyphens w:val="0"/>
+        <w:spacing w:line="240" w:lineRule="auto"/>
+        <w:ind w:leftChars="0" w:left="-2" w:firstLineChars="0" w:hanging="2"/>
+        <w:jc w:val="both"/>
+        <w:textDirection w:val="lrTb"/>
+        <w:textAlignment w:val="auto"/>
+        <w:outlineLvl w:val="9"/>
+        <w:rPr>
+          <w:position w:val="0"/>
+        </w:rPr>
+      </w:pPr>
+    </w:p>
+    <w:p>
+      <w:pPr>
+        <w:suppressAutoHyphens w:val="0"/>
+        <w:spacing w:line="240" w:lineRule="auto"/>
+        <w:ind w:leftChars="0" w:left="-2" w:firstLineChars="0" w:hanging="2"/>
+        <w:jc w:val="both"/>
+        <w:textDirection w:val="lrTb"/>
+        <w:textAlignment w:val="auto"/>
+        <w:outlineLvl w:val="9"/>
         <w:rPr>
           <w:rFonts w:ascii="Verdana" w:hAnsi="Verdana"/>
           <w:b/>
           <w:bCs/>
-          <w:position w:val="0"/>
-          <w:sz w:val="20"/>
-          <w:szCs w:val="20"/>
-        </w:rPr>
-      </w:r>
-      <w:r>
-        <w:rPr>
-          <w:rFonts w:ascii="Verdana" w:hAnsi="Verdana"/>
-          <w:position w:val="0"/>
-          <w:sz w:val="20"/>
-          <w:szCs w:val="20"/>
-        </w:rPr>
-      </w:r>
-      <w:r>
-        <w:rPr>
-          <w:rFonts w:ascii="Verdana" w:hAnsi="Verdana"/>
-          <w:color w:val="000000"/>
-          <w:position w:val="0"/>
-          <w:sz w:val="20"/>
-          <w:szCs w:val="20"/>
-        </w:rPr>
-      </w:r>
-      <w:r>
-        <w:rPr>
-          <w:rFonts w:ascii="Verdana" w:hAnsi="Verdana"/>
-          <w:color w:val="000000"/>
-          <w:position w:val="0"/>
-          <w:sz w:val="20"/>
-          <w:szCs w:val="20"/>
-        </w:rPr>
+          <w:color w:val="000000"/>
+          <w:position w:val="0"/>
+          <w:sz w:val="22"/>
+          <w:szCs w:val="22"/>
+          <w:u w:val="single"/>
+        </w:rPr>
+      </w:pPr>
+    </w:p>
+    <w:p>
+      <w:pPr>
+        <w:suppressAutoHyphens w:val="0"/>
+        <w:spacing w:line="240" w:lineRule="auto"/>
+        <w:ind w:leftChars="0" w:left="-2" w:firstLineChars="0" w:hanging="2"/>
+        <w:jc w:val="both"/>
+        <w:textDirection w:val="lrTb"/>
+        <w:textAlignment w:val="auto"/>
+        <w:outlineLvl w:val="9"/>
+        <w:rPr>
+          <w:position w:val="0"/>
+        </w:rPr>
+      </w:pPr>
+      <w:r>
+        <w:rPr>
+          <w:rFonts w:ascii="Verdana" w:hAnsi="Verdana"/>
+          <w:b/>
+          <w:bCs/>
+          <w:color w:val="000000"/>
+          <w:position w:val="0"/>
+          <w:sz w:val="22"/>
+          <w:szCs w:val="22"/>
+          <w:u w:val="single"/>
+        </w:rPr>
+        <w:t>Article 7 : Dédit ou abandon</w:t>
+      </w:r>
+    </w:p>
+    <w:p>
+      <w:pPr>
+        <w:suppressAutoHyphens w:val="0"/>
+        <w:spacing w:line="240" w:lineRule="auto"/>
+        <w:ind w:leftChars="0" w:left="0" w:firstLineChars="0" w:firstLine="0"/>
+        <w:textDirection w:val="lrTb"/>
+        <w:textAlignment w:val="auto"/>
+        <w:outlineLvl w:val="9"/>
+        <w:rPr>
+          <w:position w:val="0"/>
+        </w:rPr>
+      </w:pPr>
+    </w:p>
+    <w:p>
+      <w:pPr>
+        <w:suppressAutoHyphens w:val="0"/>
+        <w:spacing w:line="240" w:lineRule="auto"/>
+        <w:ind w:leftChars="0" w:left="-2" w:firstLineChars="0" w:hanging="2"/>
+        <w:jc w:val="both"/>
+        <w:textDirection w:val="lrTb"/>
+        <w:textAlignment w:val="auto"/>
+        <w:outlineLvl w:val="9"/>
+        <w:rPr>
+          <w:position w:val="0"/>
+        </w:rPr>
+      </w:pPr>
+      <w:r>
+        <w:rPr>
+          <w:rFonts w:ascii="Verdana" w:hAnsi="Verdana"/>
+          <w:color w:val="000000"/>
+          <w:position w:val="0"/>
+          <w:sz w:val="20"/>
+          <w:szCs w:val="20"/>
+        </w:rPr>
+        <w:t>Toute demande d’annulation doit être notifiée par écrit à NM FORMATION. En cas d’annulation avant le début de l’action, les sommes éventuellement perçues au titre de prestations de formation non réalisées sont remboursées. Lorsque l’annulation intervient à moins de 7 jours francs avant le début de l’action, les frais effectivement engagés et non récupérables pour la préparation ou l’organisation de la session peuvent faire l’objet d’une indemnité de dédit distincte du prix de la formation, sous réserve d’être justifiés. En cas d’abandon en cours de formation, les prestations effectivement réalisées restent dues. Toute indemnité de dédit est distincte des sommes facturées au titre de la formation et n’est pas imputable sur les fonds de la formation professionnelle.</w:t>
+      </w:r>
+      <w:r>
+        <w:rPr>
+          <w:rFonts w:ascii="Verdana" w:hAnsi="Verdana"/>
+          <w:position w:val="0"/>
+          <w:sz w:val="20"/>
+          <w:szCs w:val="20"/>
+        </w:rPr>
+      </w:r>
+      <w:r>
+        <w:rPr>
+          <w:rFonts w:ascii="Verdana" w:hAnsi="Verdana"/>
+          <w:color w:val="000000"/>
+          <w:position w:val="0"/>
+          <w:sz w:val="20"/>
+          <w:szCs w:val="20"/>
+        </w:rPr>
+      </w:r>
+    </w:p>
+    <w:p>
+      <w:pPr>
+        <w:suppressAutoHyphens w:val="0"/>
+        <w:spacing w:line="240" w:lineRule="auto"/>
+        <w:ind w:leftChars="0" w:left="0" w:firstLineChars="0" w:firstLine="0"/>
+        <w:textDirection w:val="lrTb"/>
+        <w:textAlignment w:val="auto"/>
+        <w:outlineLvl w:val="9"/>
+        <w:rPr>
+          <w:position w:val="0"/>
+        </w:rPr>
+      </w:pPr>
+    </w:p>
+    <w:p>
+      <w:pPr>
+        <w:suppressAutoHyphens w:val="0"/>
+        <w:spacing w:line="240" w:lineRule="auto"/>
+        <w:ind w:leftChars="0" w:left="-2" w:firstLineChars="0" w:hanging="2"/>
+        <w:jc w:val="both"/>
+        <w:textDirection w:val="lrTb"/>
+        <w:textAlignment w:val="auto"/>
+        <w:outlineLvl w:val="9"/>
+        <w:rPr>
+          <w:rFonts w:ascii="Verdana" w:hAnsi="Verdana"/>
+          <w:b/>
+          <w:bCs/>
+          <w:color w:val="000000"/>
+          <w:position w:val="0"/>
+          <w:sz w:val="22"/>
+          <w:szCs w:val="22"/>
+          <w:u w:val="single"/>
+        </w:rPr>
+      </w:pPr>
+    </w:p>
+    <w:p>
+      <w:pPr>
+        <w:suppressAutoHyphens w:val="0"/>
+        <w:spacing w:line="240" w:lineRule="auto"/>
+        <w:ind w:leftChars="0" w:left="-2" w:firstLineChars="0" w:hanging="2"/>
+        <w:jc w:val="both"/>
+        <w:textDirection w:val="lrTb"/>
+        <w:textAlignment w:val="auto"/>
+        <w:outlineLvl w:val="9"/>
+        <w:rPr>
+          <w:rFonts w:ascii="Verdana" w:hAnsi="Verdana"/>
+          <w:b/>
+          <w:bCs/>
+          <w:color w:val="000000"/>
+          <w:position w:val="0"/>
+          <w:sz w:val="22"/>
+          <w:szCs w:val="22"/>
+          <w:u w:val="single"/>
+        </w:rPr>
+      </w:pPr>
+    </w:p>
+    <w:p>
+      <w:pPr>
+        <w:suppressAutoHyphens w:val="0"/>
+        <w:spacing w:line="240" w:lineRule="auto"/>
+        <w:ind w:leftChars="0" w:left="-2" w:firstLineChars="0" w:hanging="2"/>
+        <w:jc w:val="both"/>
+        <w:textDirection w:val="lrTb"/>
+        <w:textAlignment w:val="auto"/>
+        <w:outlineLvl w:val="9"/>
+        <w:rPr>
+          <w:position w:val="0"/>
+        </w:rPr>
+      </w:pPr>
+      <w:r>
+        <w:rPr>
+          <w:rFonts w:ascii="Verdana" w:hAnsi="Verdana"/>
+          <w:b/>
+          <w:bCs/>
+          <w:color w:val="000000"/>
+          <w:position w:val="0"/>
+          <w:sz w:val="22"/>
+          <w:szCs w:val="22"/>
+          <w:u w:val="single"/>
+        </w:rPr>
+        <w:t>Article 8 : Différends éventuels </w:t>
+      </w:r>
+    </w:p>
+    <w:p>
+      <w:pPr>
+        <w:suppressAutoHyphens w:val="0"/>
+        <w:spacing w:line="240" w:lineRule="auto"/>
+        <w:ind w:leftChars="0" w:left="0" w:firstLineChars="0" w:firstLine="0"/>
+        <w:textDirection w:val="lrTb"/>
+        <w:textAlignment w:val="auto"/>
+        <w:outlineLvl w:val="9"/>
+        <w:rPr>
+          <w:position w:val="0"/>
+        </w:rPr>
+      </w:pPr>
+    </w:p>
+    <w:p>
+      <w:pPr>
+        <w:suppressAutoHyphens w:val="0"/>
+        <w:spacing w:line="240" w:lineRule="auto"/>
+        <w:ind w:leftChars="0" w:left="-2" w:firstLineChars="0" w:hanging="2"/>
+        <w:jc w:val="both"/>
+        <w:textDirection w:val="lrTb"/>
+        <w:textAlignment w:val="auto"/>
+        <w:outlineLvl w:val="9"/>
+        <w:rPr>
+          <w:position w:val="0"/>
+        </w:rPr>
+      </w:pPr>
+      <w:r>
+        <w:rPr>
+          <w:rFonts w:ascii="Verdana" w:hAnsi="Verdana"/>
+          <w:color w:val="000000"/>
+          <w:position w:val="0"/>
+          <w:sz w:val="20"/>
+          <w:szCs w:val="20"/>
+        </w:rPr>
+        <w:t xml:space="preserve">Si une contestation ou un différend ne peuvent être réglés à l’amiable, le </w:t>
+      </w:r>
+      <w:r>
+        <w:rPr>
+          <w:rFonts w:ascii="Verdana" w:hAnsi="Verdana"/>
+          <w:position w:val="0"/>
+          <w:sz w:val="20"/>
+          <w:szCs w:val="20"/>
+        </w:rPr>
+        <w:t xml:space="preserve">Tribunal de Lille sera </w:t>
+      </w:r>
+      <w:r>
+        <w:rPr>
+          <w:rFonts w:ascii="Verdana" w:hAnsi="Verdana"/>
+          <w:color w:val="000000"/>
+          <w:position w:val="0"/>
+          <w:sz w:val="20"/>
+          <w:szCs w:val="20"/>
+        </w:rPr>
+        <w:t>seul compétent pour régler le litige.</w:t>
+      </w:r>
+    </w:p>
+    <w:p>
+      <w:pPr>
+        <w:suppressAutoHyphens w:val="0"/>
+        <w:spacing w:line="240" w:lineRule="auto"/>
+        <w:ind w:leftChars="0" w:left="0" w:firstLineChars="0" w:firstLine="0"/>
+        <w:textDirection w:val="lrTb"/>
+        <w:textAlignment w:val="auto"/>
+        <w:outlineLvl w:val="9"/>
+        <w:rPr>
+          <w:position w:val="0"/>
+        </w:rPr>
+      </w:pPr>
+    </w:p>
+    <w:p>
+      <w:pPr>
+        <w:suppressAutoHyphens w:val="0"/>
+        <w:spacing w:line="240" w:lineRule="auto"/>
+        <w:ind w:leftChars="0" w:left="-2" w:firstLineChars="0" w:hanging="2"/>
+        <w:jc w:val="both"/>
+        <w:textDirection w:val="lrTb"/>
+        <w:textAlignment w:val="auto"/>
+        <w:outlineLvl w:val="9"/>
+        <w:rPr>
+          <w:rFonts w:ascii="Verdana" w:hAnsi="Verdana"/>
+          <w:color w:val="1F497D"/>
+          <w:position w:val="0"/>
+          <w:sz w:val="20"/>
+          <w:szCs w:val="20"/>
+        </w:rPr>
+      </w:pPr>
+      <w:r>
+        <w:rPr>
+          <w:rFonts w:ascii="Verdana" w:hAnsi="Verdana"/>
+          <w:color w:val="000000"/>
+          <w:position w:val="0"/>
+          <w:sz w:val="20"/>
+          <w:szCs w:val="20"/>
+        </w:rPr>
+        <w:t>Fait en double exemplaire, à LOOS le, {{DOCUMENT_DATE}} </w:t>
+      </w:r>
+    </w:p>
+    <w:p>
+      <w:pPr>
+        <w:suppressAutoHyphens w:val="0"/>
+        <w:spacing w:line="240" w:lineRule="auto"/>
+        <w:ind w:leftChars="0" w:left="-2" w:firstLineChars="0" w:hanging="2"/>
+        <w:jc w:val="both"/>
+        <w:textDirection w:val="lrTb"/>
+        <w:textAlignment w:val="auto"/>
+        <w:outlineLvl w:val="9"/>
+        <w:rPr>
+          <w:rFonts w:ascii="Verdana" w:hAnsi="Verdana"/>
+          <w:color w:val="1F497D"/>
+          <w:position w:val="0"/>
+          <w:sz w:val="20"/>
+          <w:szCs w:val="20"/>
+        </w:rPr>
+      </w:pPr>
+    </w:p>
+    <w:p>
+      <w:pPr>
+        <w:suppressAutoHyphens w:val="0"/>
+        <w:spacing w:line="240" w:lineRule="auto"/>
+        <w:ind w:leftChars="0" w:left="-2" w:firstLineChars="0" w:hanging="2"/>
+        <w:jc w:val="both"/>
+        <w:textDirection w:val="lrTb"/>
+        <w:textAlignment w:val="auto"/>
+        <w:outlineLvl w:val="9"/>
+        <w:rPr>
+          <w:rFonts w:ascii="Verdana" w:hAnsi="Verdana"/>
+          <w:color w:val="1F497D"/>
+          <w:position w:val="0"/>
+          <w:sz w:val="20"/>
+          <w:szCs w:val="20"/>
+        </w:rPr>
+      </w:pPr>
+    </w:p>
+    <w:p>
+      <w:pPr>
+        <w:suppressAutoHyphens w:val="0"/>
+        <w:spacing w:line="240" w:lineRule="auto"/>
+        <w:ind w:leftChars="0" w:left="-2" w:firstLineChars="0" w:hanging="2"/>
+        <w:jc w:val="both"/>
+        <w:textDirection w:val="lrTb"/>
+        <w:textAlignment w:val="auto"/>
+        <w:outlineLvl w:val="9"/>
+        <w:rPr>
+          <w:rFonts w:ascii="Verdana" w:hAnsi="Verdana"/>
+          <w:color w:val="1F497D"/>
+          <w:position w:val="0"/>
+          <w:sz w:val="20"/>
+          <w:szCs w:val="20"/>
+        </w:rPr>
+      </w:pPr>
+    </w:p>
+    <w:p>
+      <w:pPr>
+        <w:suppressAutoHyphens w:val="0"/>
+        <w:spacing w:line="240" w:lineRule="auto"/>
+        <w:ind w:leftChars="0" w:left="-2" w:firstLineChars="0" w:hanging="2"/>
+        <w:jc w:val="both"/>
+        <w:textDirection w:val="lrTb"/>
+        <w:textAlignment w:val="auto"/>
+        <w:outlineLvl w:val="9"/>
+        <w:rPr>
+          <w:position w:val="0"/>
+        </w:rPr>
+      </w:pPr>
+    </w:p>
+    <w:p>
+      <w:pPr>
+        <w:suppressAutoHyphens w:val="0"/>
+        <w:spacing w:line="240" w:lineRule="auto"/>
+        <w:ind w:leftChars="0" w:left="0" w:firstLineChars="0" w:firstLine="0"/>
+        <w:textDirection w:val="lrTb"/>
+        <w:textAlignment w:val="auto"/>
+        <w:outlineLvl w:val="9"/>
+        <w:rPr>
+          <w:position w:val="0"/>
+        </w:rPr>
+      </w:pPr>
+    </w:p>
+    <w:p>
+      <w:pPr>
+        <w:suppressAutoHyphens w:val="0"/>
+        <w:spacing w:line="240" w:lineRule="auto"/>
+        <w:ind w:leftChars="0" w:left="-2" w:firstLineChars="0" w:hanging="2"/>
+        <w:jc w:val="both"/>
+        <w:textDirection w:val="lrTb"/>
+        <w:textAlignment w:val="auto"/>
+        <w:outlineLvl w:val="9"/>
+        <w:rPr>
+          <w:position w:val="0"/>
+        </w:rPr>
+      </w:pPr>
+      <w:r>
+        <w:rPr>
+          <w:rFonts w:ascii="Verdana" w:hAnsi="Verdana"/>
+          <w:color w:val="000000"/>
+          <w:position w:val="0"/>
+          <w:sz w:val="20"/>
+          <w:szCs w:val="20"/>
+        </w:rPr>
+        <w:t xml:space="preserve">Pour l’entreprise {{CLIENT_NOM}}        </w:t>
+      </w:r>
+      <w:r>
+        <w:rPr>
+          <w:rFonts w:ascii="Verdana" w:hAnsi="Verdana"/>
+          <w:color w:val="000000"/>
+          <w:position w:val="0"/>
+          <w:sz w:val="20"/>
+          <w:szCs w:val="20"/>
+        </w:rPr>
+        <w:tab/>
+      </w:r>
+      <w:r>
+        <w:rPr>
+          <w:rFonts w:ascii="Verdana" w:hAnsi="Verdana"/>
+          <w:color w:val="000000"/>
+          <w:position w:val="0"/>
+          <w:sz w:val="20"/>
+          <w:szCs w:val="20"/>
+        </w:rPr>
+        <w:tab/>
+        <w:t>        </w:t>
       </w:r>
     </w:p>
     <w:p>
@@ -4706,36 +4483,27 @@
           <w:szCs w:val="20"/>
         </w:rPr>
         <w:tab/>
+      </w:r>
+      <w:r>
+        <w:rPr>
+          <w:rFonts w:ascii="Verdana" w:hAnsi="Verdana"/>
+          <w:color w:val="000000"/>
+          <w:position w:val="0"/>
+          <w:sz w:val="20"/>
+          <w:szCs w:val="20"/>
+        </w:rPr>
         <w:tab/>
+      </w:r>
+      <w:r>
+        <w:rPr>
+          <w:rFonts w:ascii="Verdana" w:hAnsi="Verdana"/>
+          <w:color w:val="000000"/>
+          <w:position w:val="0"/>
+          <w:sz w:val="20"/>
+          <w:szCs w:val="20"/>
+        </w:rPr>
         <w:tab/>
-        <w:t xml:space="preserve"> </w:t>
-      </w:r>
-      <w:r>
-        <w:rPr>
-          <w:rFonts w:ascii="Verdana" w:hAnsi="Verdana"/>
-          <w:color w:val="000000"/>
-          <w:position w:val="0"/>
-          <w:sz w:val="20"/>
-          <w:szCs w:val="20"/>
-        </w:rPr>
-      </w:r>
-      <w:r>
-        <w:rPr>
-          <w:rFonts w:ascii="Verdana" w:hAnsi="Verdana"/>
-          <w:color w:val="000000"/>
-          <w:position w:val="0"/>
-          <w:sz w:val="20"/>
-          <w:szCs w:val="20"/>
-        </w:rPr>
-      </w:r>
-      <w:r>
-        <w:rPr>
-          <w:rFonts w:ascii="Verdana" w:hAnsi="Verdana"/>
-          <w:color w:val="000000"/>
-          <w:position w:val="0"/>
-          <w:sz w:val="20"/>
-          <w:szCs w:val="20"/>
-        </w:rPr>
+        <w:t> </w:t>
       </w:r>
     </w:p>
     <w:p>
@@ -4840,51 +4608,6 @@
         </w:rPr>
         <w:br/>
       </w:r>
-      <w:r>
-        <w:rPr>
-          <w:position w:val="0"/>
-        </w:rPr>
-        <w:br/>
-      </w:r>
-    </w:p>
-    <w:p>
-      <w:pPr>
-        <w:suppressAutoHyphens w:val="0"/>
-        <w:spacing w:after="240" w:line="240" w:lineRule="auto"/>
-        <w:ind w:leftChars="0" w:left="0" w:firstLineChars="0" w:firstLine="0"/>
-        <w:textDirection w:val="lrTb"/>
-        <w:textAlignment w:val="auto"/>
-        <w:outlineLvl w:val="9"/>
-        <w:rPr>
-          <w:position w:val="0"/>
-        </w:rPr>
-      </w:pPr>
-    </w:p>
-    <w:p>
-      <w:pPr>
-        <w:suppressAutoHyphens w:val="0"/>
-        <w:spacing w:after="240" w:line="240" w:lineRule="auto"/>
-        <w:ind w:leftChars="0" w:left="0" w:firstLineChars="0" w:firstLine="0"/>
-        <w:textDirection w:val="lrTb"/>
-        <w:textAlignment w:val="auto"/>
-        <w:outlineLvl w:val="9"/>
-        <w:rPr>
-          <w:position w:val="0"/>
-        </w:rPr>
-      </w:pPr>
-    </w:p>
-    <w:p>
-      <w:pPr>
-        <w:suppressAutoHyphens w:val="0"/>
-        <w:spacing w:after="240" w:line="240" w:lineRule="auto"/>
-        <w:ind w:leftChars="0" w:left="0" w:firstLineChars="0" w:firstLine="0"/>
-        <w:textDirection w:val="lrTb"/>
-        <w:textAlignment w:val="auto"/>
-        <w:outlineLvl w:val="9"/>
-        <w:rPr>
-          <w:position w:val="0"/>
-        </w:rPr>
-      </w:pPr>
     </w:p>
     <w:p>
       <w:pPr>
@@ -5026,21 +4749,75 @@
 </w:document>
 </file>
 
+<file path=word/endnotes.xml><?xml version="1.0" encoding="utf-8"?>
+<w:endnotes xmlns:wpc="http://schemas.microsoft.com/office/word/2010/wordprocessingCanvas" xmlns:cx="http://schemas.microsoft.com/office/drawing/2014/chartex" xmlns:cx1="http://schemas.microsoft.com/office/drawing/2015/9/8/chartex" xmlns:cx2="http://schemas.microsoft.com/office/drawing/2015/10/21/chartex" xmlns:cx3="http://schemas.microsoft.com/office/drawing/2016/5/9/chartex" xmlns:cx4="http://schemas.microsoft.com/office/drawing/2016/5/10/chartex" xmlns:cx5="http://schemas.microsoft.com/office/drawing/2016/5/11/chartex" xmlns:cx6="http://schemas.microsoft.com/office/drawing/2016/5/12/chartex" xmlns:cx7="http://schemas.microsoft.com/office/drawing/2016/5/13/chartex" xmlns:cx8="http://schemas.microsoft.com/office/drawing/2016/5/14/chartex" xmlns:mc="http://schemas.openxmlformats.org/markup-compatibility/2006" xmlns:aink="http://schemas.microsoft.com/office/drawing/2016/ink" xmlns:am3d="http://schemas.microsoft.com/office/drawing/2017/model3d" xmlns:o="urn:schemas-microsoft-com:office:office" xmlns:r="http://schemas.openxmlformats.org/officeDocument/2006/relationships" xmlns:m="http://schemas.openxmlformats.org/officeDocument/2006/math" xmlns:v="urn:schemas-microsoft-com:vml" xmlns:wp14="http://schemas.microsoft.com/office/word/2010/wordprocessingDrawing" xmlns:wp="http://schemas.openxmlformats.org/drawingml/2006/wordprocessingDrawing" xmlns:w10="urn:schemas-microsoft-com:office:word" xmlns:w="http://schemas.openxmlformats.org/wordprocessingml/2006/main" xmlns:w14="http://schemas.microsoft.com/office/word/2010/wordml" xmlns:w15="http://schemas.microsoft.com/office/word/2012/wordml" xmlns:w16cex="http://schemas.microsoft.com/office/word/2018/wordml/cex" xmlns:w16cid="http://schemas.microsoft.com/office/word/2016/wordml/cid" xmlns:w16="http://schemas.microsoft.com/office/word/2018/wordml" xmlns:w16sdtdh="http://schemas.microsoft.com/office/word/2020/wordml/sdtdatahash" xmlns:w16se="http://schemas.microsoft.com/office/word/2015/wordml/symex" xmlns:wpg="http://schemas.microsoft.com/office/word/2010/wordprocessingGroup" xmlns:wpi="http://schemas.microsoft.com/office/word/2010/wordprocessingInk" xmlns:wne="http://schemas.microsoft.com/office/word/2006/wordml" xmlns:wps="http://schemas.microsoft.com/office/word/2010/wordprocessingShape" mc:Ignorable="w14 w15 w16se w16cid w16 w16cex w16sdtdh wp14">
+  <w:endnote w:type="separator" w:id="-1">
+    <w:p>
+      <w:pPr>
+        <w:spacing w:line="240" w:lineRule="auto"/>
+        <w:ind w:left="0" w:hanging="2"/>
+      </w:pPr>
+      <w:r>
+        <w:separator/>
+      </w:r>
+    </w:p>
+  </w:endnote>
+  <w:endnote w:type="continuationSeparator" w:id="0">
+    <w:p>
+      <w:pPr>
+        <w:spacing w:line="240" w:lineRule="auto"/>
+        <w:ind w:left="0" w:hanging="2"/>
+      </w:pPr>
+      <w:r>
+        <w:continuationSeparator/>
+      </w:r>
+    </w:p>
+  </w:endnote>
+</w:endnotes>
+</file>
+
 <file path=word/footer1.xml><?xml version="1.0" encoding="utf-8"?>
-<w:ftr xmlns:m="http://schemas.openxmlformats.org/officeDocument/2006/math" xmlns:mc="http://schemas.openxmlformats.org/markup-compatibility/2006" xmlns:mo="http://schemas.microsoft.com/office/mac/office/2008/main" xmlns:mv="urn:schemas-microsoft-com:mac:vml" xmlns:o="urn:schemas-microsoft-com:office:office" xmlns:r="http://schemas.openxmlformats.org/officeDocument/2006/relationships" xmlns:v="urn:schemas-microsoft-com:vml" xmlns:w10="urn:schemas-microsoft-com:office:word" xmlns:w14="http://schemas.microsoft.com/office/word/2010/wordml" xmlns:w="http://schemas.openxmlformats.org/wordprocessingml/2006/main" xmlns:wne="http://schemas.microsoft.com/office/word/2006/wordml" xmlns:wp14="http://schemas.microsoft.com/office/word/2010/wordprocessingDrawing" xmlns:wp="http://schemas.openxmlformats.org/drawingml/2006/wordprocessingDrawing" xmlns:wpc="http://schemas.microsoft.com/office/word/2010/wordprocessingCanvas" xmlns:wpg="http://schemas.microsoft.com/office/word/2010/wordprocessingGroup" xmlns:wpi="http://schemas.microsoft.com/office/word/2010/wordprocessingInk" xmlns:wps="http://schemas.microsoft.com/office/word/2010/wordprocessingShape" mc:Ignorable="w14 wp14">
+<w:ftr xmlns:wpc="http://schemas.microsoft.com/office/word/2010/wordprocessingCanvas" xmlns:cx="http://schemas.microsoft.com/office/drawing/2014/chartex" xmlns:cx1="http://schemas.microsoft.com/office/drawing/2015/9/8/chartex" xmlns:cx2="http://schemas.microsoft.com/office/drawing/2015/10/21/chartex" xmlns:cx3="http://schemas.microsoft.com/office/drawing/2016/5/9/chartex" xmlns:cx4="http://schemas.microsoft.com/office/drawing/2016/5/10/chartex" xmlns:cx5="http://schemas.microsoft.com/office/drawing/2016/5/11/chartex" xmlns:cx6="http://schemas.microsoft.com/office/drawing/2016/5/12/chartex" xmlns:cx7="http://schemas.microsoft.com/office/drawing/2016/5/13/chartex" xmlns:cx8="http://schemas.microsoft.com/office/drawing/2016/5/14/chartex" xmlns:mc="http://schemas.openxmlformats.org/markup-compatibility/2006" xmlns:aink="http://schemas.microsoft.com/office/drawing/2016/ink" xmlns:am3d="http://schemas.microsoft.com/office/drawing/2017/model3d" xmlns:o="urn:schemas-microsoft-com:office:office" xmlns:r="http://schemas.openxmlformats.org/officeDocument/2006/relationships" xmlns:m="http://schemas.openxmlformats.org/officeDocument/2006/math" xmlns:v="urn:schemas-microsoft-com:vml" xmlns:wp14="http://schemas.microsoft.com/office/word/2010/wordprocessingDrawing" xmlns:wp="http://schemas.openxmlformats.org/drawingml/2006/wordprocessingDrawing" xmlns:w10="urn:schemas-microsoft-com:office:word" xmlns:w="http://schemas.openxmlformats.org/wordprocessingml/2006/main" xmlns:w14="http://schemas.microsoft.com/office/word/2010/wordml" xmlns:w15="http://schemas.microsoft.com/office/word/2012/wordml" xmlns:w16cex="http://schemas.microsoft.com/office/word/2018/wordml/cex" xmlns:w16cid="http://schemas.microsoft.com/office/word/2016/wordml/cid" xmlns:w16="http://schemas.microsoft.com/office/word/2018/wordml" xmlns:w16sdtdh="http://schemas.microsoft.com/office/word/2020/wordml/sdtdatahash" xmlns:w16se="http://schemas.microsoft.com/office/word/2015/wordml/symex" xmlns:wpg="http://schemas.microsoft.com/office/word/2010/wordprocessingGroup" xmlns:wpi="http://schemas.microsoft.com/office/word/2010/wordprocessingInk" xmlns:wne="http://schemas.microsoft.com/office/word/2006/wordml" xmlns:wps="http://schemas.microsoft.com/office/word/2010/wordprocessingShape" mc:Ignorable="w14 w15 w16se w16cid w16 w16cex w16sdtdh wp14">
   <w:p>
     <w:pPr>
-      <w:pStyle w:val="Footer"/>
+      <w:ind w:left="0" w:hanging="2"/>
     </w:pPr>
   </w:p>
 </w:ftr>
 </file>
 
+<file path=word/footnotes.xml><?xml version="1.0" encoding="utf-8"?>
+<w:footnotes xmlns:wpc="http://schemas.microsoft.com/office/word/2010/wordprocessingCanvas" xmlns:cx="http://schemas.microsoft.com/office/drawing/2014/chartex" xmlns:cx1="http://schemas.microsoft.com/office/drawing/2015/9/8/chartex" xmlns:cx2="http://schemas.microsoft.com/office/drawing/2015/10/21/chartex" xmlns:cx3="http://schemas.microsoft.com/office/drawing/2016/5/9/chartex" xmlns:cx4="http://schemas.microsoft.com/office/drawing/2016/5/10/chartex" xmlns:cx5="http://schemas.microsoft.com/office/drawing/2016/5/11/chartex" xmlns:cx6="http://schemas.microsoft.com/office/drawing/2016/5/12/chartex" xmlns:cx7="http://schemas.microsoft.com/office/drawing/2016/5/13/chartex" xmlns:cx8="http://schemas.microsoft.com/office/drawing/2016/5/14/chartex" xmlns:mc="http://schemas.openxmlformats.org/markup-compatibility/2006" xmlns:aink="http://schemas.microsoft.com/office/drawing/2016/ink" xmlns:am3d="http://schemas.microsoft.com/office/drawing/2017/model3d" xmlns:o="urn:schemas-microsoft-com:office:office" xmlns:r="http://schemas.openxmlformats.org/officeDocument/2006/relationships" xmlns:m="http://schemas.openxmlformats.org/officeDocument/2006/math" xmlns:v="urn:schemas-microsoft-com:vml" xmlns:wp14="http://schemas.microsoft.com/office/word/2010/wordprocessingDrawing" xmlns:wp="http://schemas.openxmlformats.org/drawingml/2006/wordprocessingDrawing" xmlns:w10="urn:schemas-microsoft-com:office:word" xmlns:w="http://schemas.openxmlformats.org/wordprocessingml/2006/main" xmlns:w14="http://schemas.microsoft.com/office/word/2010/wordml" xmlns:w15="http://schemas.microsoft.com/office/word/2012/wordml" xmlns:w16cex="http://schemas.microsoft.com/office/word/2018/wordml/cex" xmlns:w16cid="http://schemas.microsoft.com/office/word/2016/wordml/cid" xmlns:w16="http://schemas.microsoft.com/office/word/2018/wordml" xmlns:w16sdtdh="http://schemas.microsoft.com/office/word/2020/wordml/sdtdatahash" xmlns:w16se="http://schemas.microsoft.com/office/word/2015/wordml/symex" xmlns:wpg="http://schemas.microsoft.com/office/word/2010/wordprocessingGroup" xmlns:wpi="http://schemas.microsoft.com/office/word/2010/wordprocessingInk" xmlns:wne="http://schemas.microsoft.com/office/word/2006/wordml" xmlns:wps="http://schemas.microsoft.com/office/word/2010/wordprocessingShape" mc:Ignorable="w14 w15 w16se w16cid w16 w16cex w16sdtdh wp14">
+  <w:footnote w:type="separator" w:id="-1">
+    <w:p>
+      <w:pPr>
+        <w:spacing w:line="240" w:lineRule="auto"/>
+        <w:ind w:left="0" w:hanging="2"/>
+      </w:pPr>
+      <w:r>
+        <w:separator/>
+      </w:r>
+    </w:p>
+  </w:footnote>
+  <w:footnote w:type="continuationSeparator" w:id="0">
+    <w:p>
+      <w:pPr>
+        <w:spacing w:line="240" w:lineRule="auto"/>
+        <w:ind w:left="0" w:hanging="2"/>
+      </w:pPr>
+      <w:r>
+        <w:continuationSeparator/>
+      </w:r>
+    </w:p>
+  </w:footnote>
+</w:footnotes>
+</file>
+
 <file path=word/header1.xml><?xml version="1.0" encoding="utf-8"?>
-<w:hdr xmlns:m="http://schemas.openxmlformats.org/officeDocument/2006/math" xmlns:mc="http://schemas.openxmlformats.org/markup-compatibility/2006" xmlns:mo="http://schemas.microsoft.com/office/mac/office/2008/main" xmlns:mv="urn:schemas-microsoft-com:mac:vml" xmlns:o="urn:schemas-microsoft-com:office:office" xmlns:r="http://schemas.openxmlformats.org/officeDocument/2006/relationships" xmlns:v="urn:schemas-microsoft-com:vml" xmlns:w10="urn:schemas-microsoft-com:office:word" xmlns:w14="http://schemas.microsoft.com/office/word/2010/wordml" xmlns:w="http://schemas.openxmlformats.org/wordprocessingml/2006/main" xmlns:wne="http://schemas.microsoft.com/office/word/2006/wordml" xmlns:wp14="http://schemas.microsoft.com/office/word/2010/wordprocessingDrawing" xmlns:wp="http://schemas.openxmlformats.org/drawingml/2006/wordprocessingDrawing" xmlns:wpc="http://schemas.microsoft.com/office/word/2010/wordprocessingCanvas" xmlns:wpg="http://schemas.microsoft.com/office/word/2010/wordprocessingGroup" xmlns:wpi="http://schemas.microsoft.com/office/word/2010/wordprocessingInk" xmlns:wps="http://schemas.microsoft.com/office/word/2010/wordprocessingShape" mc:Ignorable="w14 wp14">
+<w:hdr xmlns:wpc="http://schemas.microsoft.com/office/word/2010/wordprocessingCanvas" xmlns:cx="http://schemas.microsoft.com/office/drawing/2014/chartex" xmlns:cx1="http://schemas.microsoft.com/office/drawing/2015/9/8/chartex" xmlns:cx2="http://schemas.microsoft.com/office/drawing/2015/10/21/chartex" xmlns:cx3="http://schemas.microsoft.com/office/drawing/2016/5/9/chartex" xmlns:cx4="http://schemas.microsoft.com/office/drawing/2016/5/10/chartex" xmlns:cx5="http://schemas.microsoft.com/office/drawing/2016/5/11/chartex" xmlns:cx6="http://schemas.microsoft.com/office/drawing/2016/5/12/chartex" xmlns:cx7="http://schemas.microsoft.com/office/drawing/2016/5/13/chartex" xmlns:cx8="http://schemas.microsoft.com/office/drawing/2016/5/14/chartex" xmlns:mc="http://schemas.openxmlformats.org/markup-compatibility/2006" xmlns:aink="http://schemas.microsoft.com/office/drawing/2016/ink" xmlns:am3d="http://schemas.microsoft.com/office/drawing/2017/model3d" xmlns:o="urn:schemas-microsoft-com:office:office" xmlns:r="http://schemas.openxmlformats.org/officeDocument/2006/relationships" xmlns:m="http://schemas.openxmlformats.org/officeDocument/2006/math" xmlns:v="urn:schemas-microsoft-com:vml" xmlns:wp14="http://schemas.microsoft.com/office/word/2010/wordprocessingDrawing" xmlns:wp="http://schemas.openxmlformats.org/drawingml/2006/wordprocessingDrawing" xmlns:w10="urn:schemas-microsoft-com:office:word" xmlns:w="http://schemas.openxmlformats.org/wordprocessingml/2006/main" xmlns:w14="http://schemas.microsoft.com/office/word/2010/wordml" xmlns:w15="http://schemas.microsoft.com/office/word/2012/wordml" xmlns:w16cex="http://schemas.microsoft.com/office/word/2018/wordml/cex" xmlns:w16cid="http://schemas.microsoft.com/office/word/2016/wordml/cid" xmlns:w16="http://schemas.microsoft.com/office/word/2018/wordml" xmlns:w16sdtdh="http://schemas.microsoft.com/office/word/2020/wordml/sdtdatahash" xmlns:w16se="http://schemas.microsoft.com/office/word/2015/wordml/symex" xmlns:wpg="http://schemas.microsoft.com/office/word/2010/wordprocessingGroup" xmlns:wpi="http://schemas.microsoft.com/office/word/2010/wordprocessingInk" xmlns:wne="http://schemas.microsoft.com/office/word/2006/wordml" xmlns:wps="http://schemas.microsoft.com/office/word/2010/wordprocessingShape" mc:Ignorable="w14 w15 w16se w16cid w16 w16cex w16sdtdh wp14">
   <w:p>
     <w:pPr>
-      <w:pStyle w:val="Header"/>
+      <w:ind w:left="0" w:hanging="2"/>
     </w:pPr>
   </w:p>
 </w:hdr>

</xml_diff>